<commit_message>
Expand beginner notes in hiragana series
Co-authored-by: sin-boo <sin-boo@users.noreply.github.com>
</commit_message>
<xml_diff>
--- a/japanese_docs/output/hiragana_series/hiragana_set_01_vowels_worksheet.docx
+++ b/japanese_docs/output/hiragana_series/hiragana_set_01_vowels_worksheet.docx
@@ -271,7 +271,58 @@
           <w:color w:val="1A1A2E"/>
           <w:sz w:val="20"/>
         </w:rPr>
+        <w:t>Each hiragana letter stands for one sound chunk or beat. Read one kana smoothly instead of spelling it out like separate English letters.</w:t>
+      </w:r>
+    </w:p>
+    <w:p>
+      <w:pPr>
+        <w:pStyle w:val="ListBullet"/>
+        <w:spacing w:before="0" w:after="20"/>
+        <w:ind w:left="340"/>
+      </w:pPr>
+      <w:r>
+        <w:rPr>
+          <w:rFonts w:ascii="Calibri" w:hAnsi="Calibri"/>
+          <w:b w:val="0"/>
+          <w:i w:val="0"/>
+          <w:color w:val="1A1A2E"/>
+          <w:sz w:val="20"/>
+        </w:rPr>
         <w:t>Learn the five basic vowel sounds. These vowels appear in almost every Japanese word.</w:t>
+      </w:r>
+    </w:p>
+    <w:p>
+      <w:pPr>
+        <w:pStyle w:val="ListBullet"/>
+        <w:spacing w:before="0" w:after="20"/>
+        <w:ind w:left="340"/>
+      </w:pPr>
+      <w:r>
+        <w:rPr>
+          <w:rFonts w:ascii="Calibri" w:hAnsi="Calibri"/>
+          <w:b w:val="0"/>
+          <w:i w:val="0"/>
+          <w:color w:val="1A1A2E"/>
+          <w:sz w:val="20"/>
+        </w:rPr>
+        <w:t>These five vowels are the sound base of the whole hiragana chart: a, i, u, e, o.</w:t>
+      </w:r>
+    </w:p>
+    <w:p>
+      <w:pPr>
+        <w:pStyle w:val="ListBullet"/>
+        <w:spacing w:before="0" w:after="20"/>
+        <w:ind w:left="340"/>
+      </w:pPr>
+      <w:r>
+        <w:rPr>
+          <w:rFonts w:ascii="Calibri" w:hAnsi="Calibri"/>
+          <w:b w:val="0"/>
+          <w:i w:val="0"/>
+          <w:color w:val="1A1A2E"/>
+          <w:sz w:val="20"/>
+        </w:rPr>
+        <w:t>This set is very regular, so you can focus on the letter shape and the changing vowel sound.</w:t>
       </w:r>
     </w:p>
     <w:p>
@@ -1617,7 +1668,7 @@
           <w:color w:val="1A1A2E"/>
           <w:sz w:val="20"/>
         </w:rPr>
-        <w:t>Use this page as a reference after students finish page 1.</w:t>
+        <w:t>Use this page as a reference after students finish page 1. Read each kana left to right and treat each one as one clean sound beat.</w:t>
       </w:r>
     </w:p>
     <w:tbl>
@@ -2338,6 +2389,104 @@
     </w:p>
     <w:p>
       <w:pPr>
+        <w:spacing w:before="80" w:after="40"/>
+      </w:pPr>
+      <w:r>
+        <w:rPr>
+          <w:rFonts w:ascii="Calibri" w:hAnsi="Calibri"/>
+          <w:b/>
+          <w:i w:val="0"/>
+          <w:color w:val="007A87"/>
+          <w:sz w:val="24"/>
+        </w:rPr>
+        <w:t>How to study this set</w:t>
+      </w:r>
+    </w:p>
+    <w:p>
+      <w:pPr>
+        <w:spacing w:before="0" w:after="20"/>
+        <w:ind w:left="340"/>
+      </w:pPr>
+      <w:r>
+        <w:rPr>
+          <w:rFonts w:ascii="Calibri" w:hAnsi="Calibri"/>
+          <w:b/>
+          <w:i w:val="0"/>
+          <w:color w:val="E6A817"/>
+          <w:sz w:val="20"/>
+        </w:rPr>
+        <w:t xml:space="preserve">▸ </w:t>
+      </w:r>
+      <w:r>
+        <w:rPr>
+          <w:rFonts w:ascii="Calibri" w:hAnsi="Calibri"/>
+          <w:b w:val="0"/>
+          <w:i w:val="0"/>
+          <w:color w:val="1A1A2E"/>
+          <w:sz w:val="20"/>
+        </w:rPr>
+        <w:t>Point to one letter at a time and say the full sound in one step, such as ka or shi.</w:t>
+      </w:r>
+    </w:p>
+    <w:p>
+      <w:pPr>
+        <w:spacing w:before="0" w:after="20"/>
+        <w:ind w:left="340"/>
+      </w:pPr>
+      <w:r>
+        <w:rPr>
+          <w:rFonts w:ascii="Calibri" w:hAnsi="Calibri"/>
+          <w:b/>
+          <w:i w:val="0"/>
+          <w:color w:val="E6A817"/>
+          <w:sz w:val="20"/>
+        </w:rPr>
+        <w:t xml:space="preserve">▸ </w:t>
+      </w:r>
+      <w:r>
+        <w:rPr>
+          <w:rFonts w:ascii="Calibri" w:hAnsi="Calibri"/>
+          <w:b w:val="0"/>
+          <w:i w:val="0"/>
+          <w:color w:val="1A1A2E"/>
+          <w:sz w:val="20"/>
+        </w:rPr>
+        <w:t>When you read a practice pair, do not stop too long between the two kana.</w:t>
+      </w:r>
+    </w:p>
+    <w:p>
+      <w:pPr>
+        <w:spacing w:before="0" w:after="20"/>
+        <w:ind w:left="340"/>
+      </w:pPr>
+      <w:r>
+        <w:rPr>
+          <w:rFonts w:ascii="Calibri" w:hAnsi="Calibri"/>
+          <w:b/>
+          <w:i w:val="0"/>
+          <w:color w:val="E6A817"/>
+          <w:sz w:val="20"/>
+        </w:rPr>
+        <w:t xml:space="preserve">▸ </w:t>
+      </w:r>
+      <w:r>
+        <w:rPr>
+          <w:rFonts w:ascii="Calibri" w:hAnsi="Calibri"/>
+          <w:b w:val="0"/>
+          <w:i w:val="0"/>
+          <w:color w:val="1A1A2E"/>
+          <w:sz w:val="20"/>
+        </w:rPr>
+        <w:t>After checking the answer key, cover the sound column and quiz yourself again from memory.</w:t>
+      </w:r>
+    </w:p>
+    <w:p>
+      <w:pPr>
+        <w:spacing w:after="20"/>
+      </w:pPr>
+    </w:p>
+    <w:p>
+      <w:pPr>
         <w:spacing w:before="120" w:after="40"/>
       </w:pPr>
       <w:r>

</xml_diff>

<commit_message>
Clarify kana copying instructions
Co-authored-by: sin-boo <sin-boo@users.noreply.github.com>
</commit_message>
<xml_diff>
--- a/japanese_docs/output/hiragana_series/hiragana_set_01_vowels_worksheet.docx
+++ b/japanese_docs/output/hiragana_series/hiragana_set_01_vowels_worksheet.docx
@@ -814,6 +814,21 @@
         <w:t>Part 1 — Copy the Kana</w:t>
       </w:r>
     </w:p>
+    <w:p>
+      <w:pPr>
+        <w:spacing w:before="20" w:after="40"/>
+      </w:pPr>
+      <w:r>
+        <w:rPr>
+          <w:rFonts w:ascii="Calibri" w:hAnsi="Calibri"/>
+          <w:b w:val="0"/>
+          <w:i w:val="0"/>
+          <w:color w:val="1A1A2E"/>
+          <w:sz w:val="20"/>
+        </w:rPr>
+        <w:t>Look at each kana, say its sound out loud, then write the same kana on both blank lines.</w:t>
+      </w:r>
+    </w:p>
     <w:tbl>
       <w:tblPr>
         <w:tblStyle w:val="TableGrid"/>
@@ -856,12 +871,22 @@
             <w:r>
               <w:rPr>
                 <w:rFonts w:ascii="Calibri" w:hAnsi="Calibri"/>
+                <w:b/>
+                <w:i w:val="0"/>
+                <w:color w:val="007A87"/>
+                <w:sz w:val="16"/>
+              </w:rPr>
+              <w:t xml:space="preserve">Copy 1: </w:t>
+            </w:r>
+            <w:r>
+              <w:rPr>
+                <w:rFonts w:ascii="Calibri" w:hAnsi="Calibri"/>
                 <w:b w:val="0"/>
                 <w:i w:val="0"/>
                 <w:color w:val="1A1A2E"/>
                 <w:sz w:val="18"/>
               </w:rPr>
-              <w:t>______________________</w:t>
+              <w:t>_______________</w:t>
             </w:r>
           </w:p>
           <w:p>
@@ -872,12 +897,22 @@
             <w:r>
               <w:rPr>
                 <w:rFonts w:ascii="Calibri" w:hAnsi="Calibri"/>
+                <w:b/>
+                <w:i w:val="0"/>
+                <w:color w:val="007A87"/>
+                <w:sz w:val="16"/>
+              </w:rPr>
+              <w:t xml:space="preserve">Copy 2: </w:t>
+            </w:r>
+            <w:r>
+              <w:rPr>
+                <w:rFonts w:ascii="Calibri" w:hAnsi="Calibri"/>
                 <w:b w:val="0"/>
                 <w:i w:val="0"/>
                 <w:color w:val="1A1A2E"/>
                 <w:sz w:val="18"/>
               </w:rPr>
-              <w:t>______________________</w:t>
+              <w:t>_______________</w:t>
             </w:r>
           </w:p>
         </w:tc>
@@ -911,12 +946,22 @@
             <w:r>
               <w:rPr>
                 <w:rFonts w:ascii="Calibri" w:hAnsi="Calibri"/>
+                <w:b/>
+                <w:i w:val="0"/>
+                <w:color w:val="007A87"/>
+                <w:sz w:val="16"/>
+              </w:rPr>
+              <w:t xml:space="preserve">Copy 1: </w:t>
+            </w:r>
+            <w:r>
+              <w:rPr>
+                <w:rFonts w:ascii="Calibri" w:hAnsi="Calibri"/>
                 <w:b w:val="0"/>
                 <w:i w:val="0"/>
                 <w:color w:val="1A1A2E"/>
                 <w:sz w:val="18"/>
               </w:rPr>
-              <w:t>______________________</w:t>
+              <w:t>_______________</w:t>
             </w:r>
           </w:p>
           <w:p>
@@ -927,12 +972,22 @@
             <w:r>
               <w:rPr>
                 <w:rFonts w:ascii="Calibri" w:hAnsi="Calibri"/>
+                <w:b/>
+                <w:i w:val="0"/>
+                <w:color w:val="007A87"/>
+                <w:sz w:val="16"/>
+              </w:rPr>
+              <w:t xml:space="preserve">Copy 2: </w:t>
+            </w:r>
+            <w:r>
+              <w:rPr>
+                <w:rFonts w:ascii="Calibri" w:hAnsi="Calibri"/>
                 <w:b w:val="0"/>
                 <w:i w:val="0"/>
                 <w:color w:val="1A1A2E"/>
                 <w:sz w:val="18"/>
               </w:rPr>
-              <w:t>______________________</w:t>
+              <w:t>_______________</w:t>
             </w:r>
           </w:p>
         </w:tc>
@@ -968,12 +1023,22 @@
             <w:r>
               <w:rPr>
                 <w:rFonts w:ascii="Calibri" w:hAnsi="Calibri"/>
+                <w:b/>
+                <w:i w:val="0"/>
+                <w:color w:val="007A87"/>
+                <w:sz w:val="16"/>
+              </w:rPr>
+              <w:t xml:space="preserve">Copy 1: </w:t>
+            </w:r>
+            <w:r>
+              <w:rPr>
+                <w:rFonts w:ascii="Calibri" w:hAnsi="Calibri"/>
                 <w:b w:val="0"/>
                 <w:i w:val="0"/>
                 <w:color w:val="1A1A2E"/>
                 <w:sz w:val="18"/>
               </w:rPr>
-              <w:t>______________________</w:t>
+              <w:t>_______________</w:t>
             </w:r>
           </w:p>
           <w:p>
@@ -984,12 +1049,22 @@
             <w:r>
               <w:rPr>
                 <w:rFonts w:ascii="Calibri" w:hAnsi="Calibri"/>
+                <w:b/>
+                <w:i w:val="0"/>
+                <w:color w:val="007A87"/>
+                <w:sz w:val="16"/>
+              </w:rPr>
+              <w:t xml:space="preserve">Copy 2: </w:t>
+            </w:r>
+            <w:r>
+              <w:rPr>
+                <w:rFonts w:ascii="Calibri" w:hAnsi="Calibri"/>
                 <w:b w:val="0"/>
                 <w:i w:val="0"/>
                 <w:color w:val="1A1A2E"/>
                 <w:sz w:val="18"/>
               </w:rPr>
-              <w:t>______________________</w:t>
+              <w:t>_______________</w:t>
             </w:r>
           </w:p>
         </w:tc>
@@ -1023,12 +1098,22 @@
             <w:r>
               <w:rPr>
                 <w:rFonts w:ascii="Calibri" w:hAnsi="Calibri"/>
+                <w:b/>
+                <w:i w:val="0"/>
+                <w:color w:val="007A87"/>
+                <w:sz w:val="16"/>
+              </w:rPr>
+              <w:t xml:space="preserve">Copy 1: </w:t>
+            </w:r>
+            <w:r>
+              <w:rPr>
+                <w:rFonts w:ascii="Calibri" w:hAnsi="Calibri"/>
                 <w:b w:val="0"/>
                 <w:i w:val="0"/>
                 <w:color w:val="1A1A2E"/>
                 <w:sz w:val="18"/>
               </w:rPr>
-              <w:t>______________________</w:t>
+              <w:t>_______________</w:t>
             </w:r>
           </w:p>
           <w:p>
@@ -1039,12 +1124,22 @@
             <w:r>
               <w:rPr>
                 <w:rFonts w:ascii="Calibri" w:hAnsi="Calibri"/>
+                <w:b/>
+                <w:i w:val="0"/>
+                <w:color w:val="007A87"/>
+                <w:sz w:val="16"/>
+              </w:rPr>
+              <w:t xml:space="preserve">Copy 2: </w:t>
+            </w:r>
+            <w:r>
+              <w:rPr>
+                <w:rFonts w:ascii="Calibri" w:hAnsi="Calibri"/>
                 <w:b w:val="0"/>
                 <w:i w:val="0"/>
                 <w:color w:val="1A1A2E"/>
                 <w:sz w:val="18"/>
               </w:rPr>
-              <w:t>______________________</w:t>
+              <w:t>_______________</w:t>
             </w:r>
           </w:p>
         </w:tc>
@@ -1080,12 +1175,22 @@
             <w:r>
               <w:rPr>
                 <w:rFonts w:ascii="Calibri" w:hAnsi="Calibri"/>
+                <w:b/>
+                <w:i w:val="0"/>
+                <w:color w:val="007A87"/>
+                <w:sz w:val="16"/>
+              </w:rPr>
+              <w:t xml:space="preserve">Copy 1: </w:t>
+            </w:r>
+            <w:r>
+              <w:rPr>
+                <w:rFonts w:ascii="Calibri" w:hAnsi="Calibri"/>
                 <w:b w:val="0"/>
                 <w:i w:val="0"/>
                 <w:color w:val="1A1A2E"/>
                 <w:sz w:val="18"/>
               </w:rPr>
-              <w:t>______________________</w:t>
+              <w:t>_______________</w:t>
             </w:r>
           </w:p>
           <w:p>
@@ -1096,12 +1201,22 @@
             <w:r>
               <w:rPr>
                 <w:rFonts w:ascii="Calibri" w:hAnsi="Calibri"/>
+                <w:b/>
+                <w:i w:val="0"/>
+                <w:color w:val="007A87"/>
+                <w:sz w:val="16"/>
+              </w:rPr>
+              <w:t xml:space="preserve">Copy 2: </w:t>
+            </w:r>
+            <w:r>
+              <w:rPr>
+                <w:rFonts w:ascii="Calibri" w:hAnsi="Calibri"/>
                 <w:b w:val="0"/>
                 <w:i w:val="0"/>
                 <w:color w:val="1A1A2E"/>
                 <w:sz w:val="18"/>
               </w:rPr>
-              <w:t>______________________</w:t>
+              <w:t>_______________</w:t>
             </w:r>
           </w:p>
         </w:tc>

</xml_diff>

<commit_message>
Refine kana copy instruction wording
Co-authored-by: sin-boo <sin-boo@users.noreply.github.com>
</commit_message>
<xml_diff>
--- a/japanese_docs/output/hiragana_series/hiragana_set_01_vowels_worksheet.docx
+++ b/japanese_docs/output/hiragana_series/hiragana_set_01_vowels_worksheet.docx
@@ -826,7 +826,67 @@
           <w:color w:val="1A1A2E"/>
           <w:sz w:val="20"/>
         </w:rPr>
-        <w:t>Look at each kana, say its sound out loud, then write the same kana on both blank lines.</w:t>
+        <w:t xml:space="preserve">Look at each kana. </w:t>
+      </w:r>
+      <w:r>
+        <w:rPr>
+          <w:rFonts w:ascii="Calibri" w:hAnsi="Calibri"/>
+          <w:b/>
+          <w:i w:val="0"/>
+          <w:color w:val="007A87"/>
+          <w:sz w:val="20"/>
+        </w:rPr>
+        <w:t>Say the sound out loud first</w:t>
+      </w:r>
+      <w:r>
+        <w:rPr>
+          <w:rFonts w:ascii="Calibri" w:hAnsi="Calibri"/>
+          <w:b w:val="0"/>
+          <w:i w:val="0"/>
+          <w:color w:val="1A1A2E"/>
+          <w:sz w:val="20"/>
+        </w:rPr>
+        <w:t xml:space="preserve"> and focus on </w:t>
+      </w:r>
+      <w:r>
+        <w:rPr>
+          <w:rFonts w:ascii="Calibri" w:hAnsi="Calibri"/>
+          <w:b/>
+          <w:i w:val="0"/>
+          <w:color w:val="1A3A5C"/>
+          <w:sz w:val="20"/>
+        </w:rPr>
+        <w:t>how it sounds</w:t>
+      </w:r>
+      <w:r>
+        <w:rPr>
+          <w:rFonts w:ascii="Calibri" w:hAnsi="Calibri"/>
+          <w:b w:val="0"/>
+          <w:i w:val="0"/>
+          <w:color w:val="1A1A2E"/>
+          <w:sz w:val="20"/>
+        </w:rPr>
+        <w:t xml:space="preserve">, not on describing the symbol. </w:t>
+      </w:r>
+      <w:r>
+        <w:rPr>
+          <w:rFonts w:ascii="Calibri" w:hAnsi="Calibri"/>
+          <w:b/>
+          <w:i w:val="0"/>
+          <w:color w:val="007A87"/>
+          <w:sz w:val="20"/>
+        </w:rPr>
+        <w:t>Then copy the kana itself</w:t>
+      </w:r>
+      <w:r>
+        <w:rPr>
+          <w:rFonts w:ascii="Calibri" w:hAnsi="Calibri"/>
+          <w:b w:val="0"/>
+          <w:i w:val="0"/>
+          <w:color w:val="1A1A2E"/>
+          <w:sz w:val="20"/>
+        </w:rPr>
+        <w:t xml:space="preserve"> on both blank lines.</w:t>
       </w:r>
     </w:p>
     <w:tbl>

</xml_diff>

<commit_message>
Add kana sound examples to copy instructions
Co-authored-by: sin-boo <sin-boo@users.noreply.github.com>
</commit_message>
<xml_diff>
--- a/japanese_docs/output/hiragana_series/hiragana_set_01_vowels_worksheet.docx
+++ b/japanese_docs/output/hiragana_series/hiragana_set_01_vowels_worksheet.docx
@@ -887,6 +887,26 @@
           <w:sz w:val="20"/>
         </w:rPr>
         <w:t xml:space="preserve"> on both blank lines.</w:t>
+      </w:r>
+      <w:r>
+        <w:rPr>
+          <w:rFonts w:ascii="Calibri" w:hAnsi="Calibri"/>
+          <w:b/>
+          <w:i w:val="0"/>
+          <w:color w:val="E6A817"/>
+          <w:sz w:val="20"/>
+        </w:rPr>
+        <w:t xml:space="preserve"> Example: </w:t>
+      </w:r>
+      <w:r>
+        <w:rPr>
+          <w:rFonts w:ascii="Calibri" w:hAnsi="Calibri"/>
+          <w:b w:val="0"/>
+          <w:i/>
+          <w:color w:val="6B7B8D"/>
+          <w:sz w:val="20"/>
+        </w:rPr>
+        <w:t>あ = a, い = i, う = u</w:t>
       </w:r>
     </w:p>
     <w:tbl>

</xml_diff>

<commit_message>
Remove kana copy section from hiragana series
Co-authored-by: sin-boo <sin-boo@users.noreply.github.com>
</commit_message>
<xml_diff>
--- a/japanese_docs/output/hiragana_series/hiragana_set_01_vowels_worksheet.docx
+++ b/japanese_docs/output/hiragana_series/hiragana_set_01_vowels_worksheet.docx
@@ -801,525 +801,6 @@
       <w:pPr>
         <w:spacing w:before="60" w:after="40"/>
         <w:ind w:left="170"/>
-        <w:shd w:val="clear" w:color="auto" w:fill="1A3A5C"/>
-      </w:pPr>
-      <w:r>
-        <w:rPr>
-          <w:rFonts w:ascii="Calibri" w:hAnsi="Calibri"/>
-          <w:b/>
-          <w:i w:val="0"/>
-          <w:color w:val="FFFFFF"/>
-          <w:sz w:val="24"/>
-        </w:rPr>
-        <w:t>Part 1 — Copy the Kana</w:t>
-      </w:r>
-    </w:p>
-    <w:p>
-      <w:pPr>
-        <w:spacing w:before="20" w:after="40"/>
-      </w:pPr>
-      <w:r>
-        <w:rPr>
-          <w:rFonts w:ascii="Calibri" w:hAnsi="Calibri"/>
-          <w:b w:val="0"/>
-          <w:i w:val="0"/>
-          <w:color w:val="1A1A2E"/>
-          <w:sz w:val="20"/>
-        </w:rPr>
-        <w:t xml:space="preserve">Look at each kana. </w:t>
-      </w:r>
-      <w:r>
-        <w:rPr>
-          <w:rFonts w:ascii="Calibri" w:hAnsi="Calibri"/>
-          <w:b/>
-          <w:i w:val="0"/>
-          <w:color w:val="007A87"/>
-          <w:sz w:val="20"/>
-        </w:rPr>
-        <w:t>Say the sound out loud first</w:t>
-      </w:r>
-      <w:r>
-        <w:rPr>
-          <w:rFonts w:ascii="Calibri" w:hAnsi="Calibri"/>
-          <w:b w:val="0"/>
-          <w:i w:val="0"/>
-          <w:color w:val="1A1A2E"/>
-          <w:sz w:val="20"/>
-        </w:rPr>
-        <w:t xml:space="preserve"> and focus on </w:t>
-      </w:r>
-      <w:r>
-        <w:rPr>
-          <w:rFonts w:ascii="Calibri" w:hAnsi="Calibri"/>
-          <w:b/>
-          <w:i w:val="0"/>
-          <w:color w:val="1A3A5C"/>
-          <w:sz w:val="20"/>
-        </w:rPr>
-        <w:t>how it sounds</w:t>
-      </w:r>
-      <w:r>
-        <w:rPr>
-          <w:rFonts w:ascii="Calibri" w:hAnsi="Calibri"/>
-          <w:b w:val="0"/>
-          <w:i w:val="0"/>
-          <w:color w:val="1A1A2E"/>
-          <w:sz w:val="20"/>
-        </w:rPr>
-        <w:t xml:space="preserve">, not on describing the symbol. </w:t>
-      </w:r>
-      <w:r>
-        <w:rPr>
-          <w:rFonts w:ascii="Calibri" w:hAnsi="Calibri"/>
-          <w:b/>
-          <w:i w:val="0"/>
-          <w:color w:val="007A87"/>
-          <w:sz w:val="20"/>
-        </w:rPr>
-        <w:t>Then copy the kana itself</w:t>
-      </w:r>
-      <w:r>
-        <w:rPr>
-          <w:rFonts w:ascii="Calibri" w:hAnsi="Calibri"/>
-          <w:b w:val="0"/>
-          <w:i w:val="0"/>
-          <w:color w:val="1A1A2E"/>
-          <w:sz w:val="20"/>
-        </w:rPr>
-        <w:t xml:space="preserve"> on both blank lines.</w:t>
-      </w:r>
-      <w:r>
-        <w:rPr>
-          <w:rFonts w:ascii="Calibri" w:hAnsi="Calibri"/>
-          <w:b/>
-          <w:i w:val="0"/>
-          <w:color w:val="E6A817"/>
-          <w:sz w:val="20"/>
-        </w:rPr>
-        <w:t xml:space="preserve"> Example: </w:t>
-      </w:r>
-      <w:r>
-        <w:rPr>
-          <w:rFonts w:ascii="Calibri" w:hAnsi="Calibri"/>
-          <w:b w:val="0"/>
-          <w:i/>
-          <w:color w:val="6B7B8D"/>
-          <w:sz w:val="20"/>
-        </w:rPr>
-        <w:t>あ = a, い = i, う = u</w:t>
-      </w:r>
-    </w:p>
-    <w:tbl>
-      <w:tblPr>
-        <w:tblStyle w:val="TableGrid"/>
-        <w:tblW w:type="auto" w:w="0"/>
-        <w:tblLayout w:type="fixed"/>
-        <w:tblLook w:firstColumn="1" w:firstRow="1" w:lastColumn="0" w:lastRow="0" w:noHBand="0" w:noVBand="1" w:val="04A0"/>
-      </w:tblPr>
-      <w:tblGrid>
-        <w:gridCol w:w="5832"/>
-        <w:gridCol w:w="5832"/>
-      </w:tblGrid>
-      <w:tr>
-        <w:tc>
-          <w:tcPr>
-            <w:tcW w:type="dxa" w:w="5760"/>
-            <w:vAlign w:val="top"/>
-            <w:shd w:val="clear" w:color="auto" w:fill="D4F1F4"/>
-          </w:tcPr>
-          <w:p>
-            <w:pPr>
-              <w:spacing w:before="40" w:after="0"/>
-              <w:jc w:val="center"/>
-            </w:pPr>
-            <w:r>
-              <w:rPr>
-                <w:rFonts w:ascii="Calibri" w:hAnsi="Calibri"/>
-                <w:b/>
-                <w:i w:val="0"/>
-                <w:color w:val="1A3A5C"/>
-                <w:sz w:val="40"/>
-              </w:rPr>
-              <w:t>あ</w:t>
-            </w:r>
-          </w:p>
-          <w:p>
-            <w:pPr>
-              <w:spacing w:before="0" w:after="0"/>
-              <w:jc w:val="center"/>
-            </w:pPr>
-            <w:r>
-              <w:rPr>
-                <w:rFonts w:ascii="Calibri" w:hAnsi="Calibri"/>
-                <w:b/>
-                <w:i w:val="0"/>
-                <w:color w:val="007A87"/>
-                <w:sz w:val="16"/>
-              </w:rPr>
-              <w:t xml:space="preserve">Copy 1: </w:t>
-            </w:r>
-            <w:r>
-              <w:rPr>
-                <w:rFonts w:ascii="Calibri" w:hAnsi="Calibri"/>
-                <w:b w:val="0"/>
-                <w:i w:val="0"/>
-                <w:color w:val="1A1A2E"/>
-                <w:sz w:val="18"/>
-              </w:rPr>
-              <w:t>_______________</w:t>
-            </w:r>
-          </w:p>
-          <w:p>
-            <w:pPr>
-              <w:spacing w:before="0" w:after="0"/>
-              <w:jc w:val="center"/>
-            </w:pPr>
-            <w:r>
-              <w:rPr>
-                <w:rFonts w:ascii="Calibri" w:hAnsi="Calibri"/>
-                <w:b/>
-                <w:i w:val="0"/>
-                <w:color w:val="007A87"/>
-                <w:sz w:val="16"/>
-              </w:rPr>
-              <w:t xml:space="preserve">Copy 2: </w:t>
-            </w:r>
-            <w:r>
-              <w:rPr>
-                <w:rFonts w:ascii="Calibri" w:hAnsi="Calibri"/>
-                <w:b w:val="0"/>
-                <w:i w:val="0"/>
-                <w:color w:val="1A1A2E"/>
-                <w:sz w:val="18"/>
-              </w:rPr>
-              <w:t>_______________</w:t>
-            </w:r>
-          </w:p>
-        </w:tc>
-        <w:tc>
-          <w:tcPr>
-            <w:tcW w:type="dxa" w:w="5760"/>
-            <w:vAlign w:val="top"/>
-            <w:shd w:val="clear" w:color="auto" w:fill="D4F1F4"/>
-          </w:tcPr>
-          <w:p>
-            <w:pPr>
-              <w:spacing w:before="40" w:after="0"/>
-              <w:jc w:val="center"/>
-            </w:pPr>
-            <w:r>
-              <w:rPr>
-                <w:rFonts w:ascii="Calibri" w:hAnsi="Calibri"/>
-                <w:b/>
-                <w:i w:val="0"/>
-                <w:color w:val="1A3A5C"/>
-                <w:sz w:val="40"/>
-              </w:rPr>
-              <w:t>い</w:t>
-            </w:r>
-          </w:p>
-          <w:p>
-            <w:pPr>
-              <w:spacing w:before="0" w:after="0"/>
-              <w:jc w:val="center"/>
-            </w:pPr>
-            <w:r>
-              <w:rPr>
-                <w:rFonts w:ascii="Calibri" w:hAnsi="Calibri"/>
-                <w:b/>
-                <w:i w:val="0"/>
-                <w:color w:val="007A87"/>
-                <w:sz w:val="16"/>
-              </w:rPr>
-              <w:t xml:space="preserve">Copy 1: </w:t>
-            </w:r>
-            <w:r>
-              <w:rPr>
-                <w:rFonts w:ascii="Calibri" w:hAnsi="Calibri"/>
-                <w:b w:val="0"/>
-                <w:i w:val="0"/>
-                <w:color w:val="1A1A2E"/>
-                <w:sz w:val="18"/>
-              </w:rPr>
-              <w:t>_______________</w:t>
-            </w:r>
-          </w:p>
-          <w:p>
-            <w:pPr>
-              <w:spacing w:before="0" w:after="0"/>
-              <w:jc w:val="center"/>
-            </w:pPr>
-            <w:r>
-              <w:rPr>
-                <w:rFonts w:ascii="Calibri" w:hAnsi="Calibri"/>
-                <w:b/>
-                <w:i w:val="0"/>
-                <w:color w:val="007A87"/>
-                <w:sz w:val="16"/>
-              </w:rPr>
-              <w:t xml:space="preserve">Copy 2: </w:t>
-            </w:r>
-            <w:r>
-              <w:rPr>
-                <w:rFonts w:ascii="Calibri" w:hAnsi="Calibri"/>
-                <w:b w:val="0"/>
-                <w:i w:val="0"/>
-                <w:color w:val="1A1A2E"/>
-                <w:sz w:val="18"/>
-              </w:rPr>
-              <w:t>_______________</w:t>
-            </w:r>
-          </w:p>
-        </w:tc>
-      </w:tr>
-      <w:tr>
-        <w:tc>
-          <w:tcPr>
-            <w:tcW w:type="dxa" w:w="5760"/>
-            <w:vAlign w:val="top"/>
-            <w:shd w:val="clear" w:color="auto" w:fill="FFFFFF"/>
-          </w:tcPr>
-          <w:p>
-            <w:pPr>
-              <w:spacing w:before="40" w:after="0"/>
-              <w:jc w:val="center"/>
-            </w:pPr>
-            <w:r>
-              <w:rPr>
-                <w:rFonts w:ascii="Calibri" w:hAnsi="Calibri"/>
-                <w:b/>
-                <w:i w:val="0"/>
-                <w:color w:val="1A3A5C"/>
-                <w:sz w:val="40"/>
-              </w:rPr>
-              <w:t>う</w:t>
-            </w:r>
-          </w:p>
-          <w:p>
-            <w:pPr>
-              <w:spacing w:before="0" w:after="0"/>
-              <w:jc w:val="center"/>
-            </w:pPr>
-            <w:r>
-              <w:rPr>
-                <w:rFonts w:ascii="Calibri" w:hAnsi="Calibri"/>
-                <w:b/>
-                <w:i w:val="0"/>
-                <w:color w:val="007A87"/>
-                <w:sz w:val="16"/>
-              </w:rPr>
-              <w:t xml:space="preserve">Copy 1: </w:t>
-            </w:r>
-            <w:r>
-              <w:rPr>
-                <w:rFonts w:ascii="Calibri" w:hAnsi="Calibri"/>
-                <w:b w:val="0"/>
-                <w:i w:val="0"/>
-                <w:color w:val="1A1A2E"/>
-                <w:sz w:val="18"/>
-              </w:rPr>
-              <w:t>_______________</w:t>
-            </w:r>
-          </w:p>
-          <w:p>
-            <w:pPr>
-              <w:spacing w:before="0" w:after="0"/>
-              <w:jc w:val="center"/>
-            </w:pPr>
-            <w:r>
-              <w:rPr>
-                <w:rFonts w:ascii="Calibri" w:hAnsi="Calibri"/>
-                <w:b/>
-                <w:i w:val="0"/>
-                <w:color w:val="007A87"/>
-                <w:sz w:val="16"/>
-              </w:rPr>
-              <w:t xml:space="preserve">Copy 2: </w:t>
-            </w:r>
-            <w:r>
-              <w:rPr>
-                <w:rFonts w:ascii="Calibri" w:hAnsi="Calibri"/>
-                <w:b w:val="0"/>
-                <w:i w:val="0"/>
-                <w:color w:val="1A1A2E"/>
-                <w:sz w:val="18"/>
-              </w:rPr>
-              <w:t>_______________</w:t>
-            </w:r>
-          </w:p>
-        </w:tc>
-        <w:tc>
-          <w:tcPr>
-            <w:tcW w:type="dxa" w:w="5760"/>
-            <w:vAlign w:val="top"/>
-            <w:shd w:val="clear" w:color="auto" w:fill="FFFFFF"/>
-          </w:tcPr>
-          <w:p>
-            <w:pPr>
-              <w:spacing w:before="40" w:after="0"/>
-              <w:jc w:val="center"/>
-            </w:pPr>
-            <w:r>
-              <w:rPr>
-                <w:rFonts w:ascii="Calibri" w:hAnsi="Calibri"/>
-                <w:b/>
-                <w:i w:val="0"/>
-                <w:color w:val="1A3A5C"/>
-                <w:sz w:val="40"/>
-              </w:rPr>
-              <w:t>え</w:t>
-            </w:r>
-          </w:p>
-          <w:p>
-            <w:pPr>
-              <w:spacing w:before="0" w:after="0"/>
-              <w:jc w:val="center"/>
-            </w:pPr>
-            <w:r>
-              <w:rPr>
-                <w:rFonts w:ascii="Calibri" w:hAnsi="Calibri"/>
-                <w:b/>
-                <w:i w:val="0"/>
-                <w:color w:val="007A87"/>
-                <w:sz w:val="16"/>
-              </w:rPr>
-              <w:t xml:space="preserve">Copy 1: </w:t>
-            </w:r>
-            <w:r>
-              <w:rPr>
-                <w:rFonts w:ascii="Calibri" w:hAnsi="Calibri"/>
-                <w:b w:val="0"/>
-                <w:i w:val="0"/>
-                <w:color w:val="1A1A2E"/>
-                <w:sz w:val="18"/>
-              </w:rPr>
-              <w:t>_______________</w:t>
-            </w:r>
-          </w:p>
-          <w:p>
-            <w:pPr>
-              <w:spacing w:before="0" w:after="0"/>
-              <w:jc w:val="center"/>
-            </w:pPr>
-            <w:r>
-              <w:rPr>
-                <w:rFonts w:ascii="Calibri" w:hAnsi="Calibri"/>
-                <w:b/>
-                <w:i w:val="0"/>
-                <w:color w:val="007A87"/>
-                <w:sz w:val="16"/>
-              </w:rPr>
-              <w:t xml:space="preserve">Copy 2: </w:t>
-            </w:r>
-            <w:r>
-              <w:rPr>
-                <w:rFonts w:ascii="Calibri" w:hAnsi="Calibri"/>
-                <w:b w:val="0"/>
-                <w:i w:val="0"/>
-                <w:color w:val="1A1A2E"/>
-                <w:sz w:val="18"/>
-              </w:rPr>
-              <w:t>_______________</w:t>
-            </w:r>
-          </w:p>
-        </w:tc>
-      </w:tr>
-      <w:tr>
-        <w:tc>
-          <w:tcPr>
-            <w:tcW w:type="dxa" w:w="5760"/>
-            <w:vAlign w:val="top"/>
-            <w:shd w:val="clear" w:color="auto" w:fill="D4F1F4"/>
-          </w:tcPr>
-          <w:p>
-            <w:pPr>
-              <w:spacing w:before="40" w:after="0"/>
-              <w:jc w:val="center"/>
-            </w:pPr>
-            <w:r>
-              <w:rPr>
-                <w:rFonts w:ascii="Calibri" w:hAnsi="Calibri"/>
-                <w:b/>
-                <w:i w:val="0"/>
-                <w:color w:val="1A3A5C"/>
-                <w:sz w:val="40"/>
-              </w:rPr>
-              <w:t>お</w:t>
-            </w:r>
-          </w:p>
-          <w:p>
-            <w:pPr>
-              <w:spacing w:before="0" w:after="0"/>
-              <w:jc w:val="center"/>
-            </w:pPr>
-            <w:r>
-              <w:rPr>
-                <w:rFonts w:ascii="Calibri" w:hAnsi="Calibri"/>
-                <w:b/>
-                <w:i w:val="0"/>
-                <w:color w:val="007A87"/>
-                <w:sz w:val="16"/>
-              </w:rPr>
-              <w:t xml:space="preserve">Copy 1: </w:t>
-            </w:r>
-            <w:r>
-              <w:rPr>
-                <w:rFonts w:ascii="Calibri" w:hAnsi="Calibri"/>
-                <w:b w:val="0"/>
-                <w:i w:val="0"/>
-                <w:color w:val="1A1A2E"/>
-                <w:sz w:val="18"/>
-              </w:rPr>
-              <w:t>_______________</w:t>
-            </w:r>
-          </w:p>
-          <w:p>
-            <w:pPr>
-              <w:spacing w:before="0" w:after="0"/>
-              <w:jc w:val="center"/>
-            </w:pPr>
-            <w:r>
-              <w:rPr>
-                <w:rFonts w:ascii="Calibri" w:hAnsi="Calibri"/>
-                <w:b/>
-                <w:i w:val="0"/>
-                <w:color w:val="007A87"/>
-                <w:sz w:val="16"/>
-              </w:rPr>
-              <w:t xml:space="preserve">Copy 2: </w:t>
-            </w:r>
-            <w:r>
-              <w:rPr>
-                <w:rFonts w:ascii="Calibri" w:hAnsi="Calibri"/>
-                <w:b w:val="0"/>
-                <w:i w:val="0"/>
-                <w:color w:val="1A1A2E"/>
-                <w:sz w:val="18"/>
-              </w:rPr>
-              <w:t>_______________</w:t>
-            </w:r>
-          </w:p>
-        </w:tc>
-        <w:tc>
-          <w:tcPr>
-            <w:tcW w:type="dxa" w:w="5760"/>
-            <w:vAlign w:val="top"/>
-          </w:tcPr>
-          <w:p>
-            <w:r/>
-          </w:p>
-        </w:tc>
-      </w:tr>
-    </w:tbl>
-    <w:p>
-      <w:pPr>
-        <w:spacing w:after="20"/>
-      </w:pPr>
-    </w:p>
-    <w:p>
-      <w:pPr>
-        <w:spacing w:before="60" w:after="40"/>
-        <w:ind w:left="170"/>
         <w:shd w:val="clear" w:color="auto" w:fill="007A87"/>
       </w:pPr>
       <w:r>
@@ -1330,7 +811,7 @@
           <w:color w:val="FFFFFF"/>
           <w:sz w:val="24"/>
         </w:rPr>
-        <w:t>Part 2 — Match the Sound</w:t>
+        <w:t>Part 1 — Match the Sound</w:t>
       </w:r>
     </w:p>
     <w:tbl>
@@ -1848,7 +1329,7 @@
           <w:color w:val="FFFFFF"/>
           <w:sz w:val="24"/>
         </w:rPr>
-        <w:t>Part 3 — Read and Check</w:t>
+        <w:t>Part 2 — Read and Check</w:t>
       </w:r>
     </w:p>
     <w:p>
@@ -2136,7 +1617,7 @@
           <w:color w:val="FFFFFF"/>
           <w:sz w:val="24"/>
         </w:rPr>
-        <w:t>Part 2 Answer Key</w:t>
+        <w:t>Part 1 Answer Key</w:t>
       </w:r>
     </w:p>
     <w:tbl>

</xml_diff>

<commit_message>
Rework hiragana series activities and answers
Co-authored-by: sin-boo <sin-boo@users.noreply.github.com>
</commit_message>
<xml_diff>
--- a/japanese_docs/output/hiragana_series/hiragana_set_01_vowels_worksheet.docx
+++ b/japanese_docs/output/hiragana_series/hiragana_set_01_vowels_worksheet.docx
@@ -237,7 +237,7 @@
           <w:color w:val="1A3A5C"/>
           <w:sz w:val="28"/>
         </w:rPr>
-        <w:t>What you are learning</w:t>
+        <w:t>How this set works</w:t>
       </w:r>
     </w:p>
     <w:p>
@@ -339,8 +339,205 @@
           <w:color w:val="1A1A2E"/>
           <w:sz w:val="20"/>
         </w:rPr>
-        <w:t>Say the sound, copy the kana, then match the kana to the correct sound hint.</w:t>
+        <w:t>You will do two activities: write the reading from memory, then use row-pattern practice to check if you really know the set.</w:t>
       </w:r>
+    </w:p>
+    <w:p>
+      <w:pPr>
+        <w:spacing w:after="20"/>
+      </w:pPr>
+    </w:p>
+    <w:p>
+      <w:pPr>
+        <w:spacing w:before="60" w:after="40"/>
+        <w:ind w:left="170"/>
+        <w:shd w:val="clear" w:color="auto" w:fill="E6A817"/>
+      </w:pPr>
+      <w:r>
+        <w:rPr>
+          <w:rFonts w:ascii="Calibri" w:hAnsi="Calibri"/>
+          <w:b/>
+          <w:i w:val="0"/>
+          <w:color w:val="FFFFFF"/>
+          <w:sz w:val="24"/>
+        </w:rPr>
+        <w:t>Worked Examples</w:t>
+      </w:r>
+    </w:p>
+    <w:tbl>
+      <w:tblPr>
+        <w:tblStyle w:val="TableGrid"/>
+        <w:tblW w:type="auto" w:w="0"/>
+        <w:tblLook w:firstColumn="1" w:firstRow="1" w:lastColumn="0" w:lastRow="0" w:noHBand="0" w:noVBand="1" w:val="04A0"/>
+      </w:tblPr>
+      <w:tblGrid>
+        <w:gridCol w:w="3888"/>
+        <w:gridCol w:w="3888"/>
+        <w:gridCol w:w="3888"/>
+      </w:tblGrid>
+      <w:tr>
+        <w:tc>
+          <w:tcPr>
+            <w:tcW w:type="dxa" w:w="3888"/>
+            <w:shd w:val="clear" w:color="auto" w:fill="F0F6FA"/>
+            <w:vAlign w:val="top"/>
+          </w:tcPr>
+          <w:p>
+            <w:pPr>
+              <w:spacing w:before="40" w:after="20"/>
+            </w:pPr>
+            <w:r>
+              <w:rPr>
+                <w:rFonts w:ascii="Calibri" w:hAnsi="Calibri"/>
+                <w:b/>
+                <w:i w:val="0"/>
+                <w:color w:val="007A87"/>
+                <w:sz w:val="18"/>
+              </w:rPr>
+              <w:t>Example</w:t>
+            </w:r>
+          </w:p>
+          <w:p>
+            <w:pPr>
+              <w:spacing w:before="0" w:after="0"/>
+            </w:pPr>
+            <w:r>
+              <w:rPr>
+                <w:rFonts w:ascii="Calibri" w:hAnsi="Calibri"/>
+                <w:b/>
+                <w:i w:val="0"/>
+                <w:color w:val="1A3A5C"/>
+                <w:sz w:val="22"/>
+              </w:rPr>
+              <w:t>あ</w:t>
+            </w:r>
+          </w:p>
+          <w:p>
+            <w:pPr>
+              <w:spacing w:before="0" w:after="40"/>
+            </w:pPr>
+            <w:r>
+              <w:rPr>
+                <w:rFonts w:ascii="Calibri" w:hAnsi="Calibri"/>
+                <w:b w:val="0"/>
+                <w:i w:val="0"/>
+                <w:color w:val="1A1A2E"/>
+                <w:sz w:val="18"/>
+              </w:rPr>
+              <w:t>Answer: a</w:t>
+            </w:r>
+          </w:p>
+        </w:tc>
+        <w:tc>
+          <w:tcPr>
+            <w:tcW w:type="dxa" w:w="3888"/>
+            <w:shd w:val="clear" w:color="auto" w:fill="F0F6FA"/>
+            <w:vAlign w:val="top"/>
+          </w:tcPr>
+          <w:p>
+            <w:pPr>
+              <w:spacing w:before="40" w:after="20"/>
+            </w:pPr>
+            <w:r>
+              <w:rPr>
+                <w:rFonts w:ascii="Calibri" w:hAnsi="Calibri"/>
+                <w:b/>
+                <w:i w:val="0"/>
+                <w:color w:val="007A87"/>
+                <w:sz w:val="18"/>
+              </w:rPr>
+              <w:t>Example</w:t>
+            </w:r>
+          </w:p>
+          <w:p>
+            <w:pPr>
+              <w:spacing w:before="0" w:after="0"/>
+            </w:pPr>
+            <w:r>
+              <w:rPr>
+                <w:rFonts w:ascii="Calibri" w:hAnsi="Calibri"/>
+                <w:b/>
+                <w:i w:val="0"/>
+                <w:color w:val="1A3A5C"/>
+                <w:sz w:val="22"/>
+              </w:rPr>
+              <w:t>あい</w:t>
+            </w:r>
+          </w:p>
+          <w:p>
+            <w:pPr>
+              <w:spacing w:before="0" w:after="40"/>
+            </w:pPr>
+            <w:r>
+              <w:rPr>
+                <w:rFonts w:ascii="Calibri" w:hAnsi="Calibri"/>
+                <w:b w:val="0"/>
+                <w:i w:val="0"/>
+                <w:color w:val="1A1A2E"/>
+                <w:sz w:val="18"/>
+              </w:rPr>
+              <w:t>Answer: a-i</w:t>
+            </w:r>
+          </w:p>
+        </w:tc>
+        <w:tc>
+          <w:tcPr>
+            <w:tcW w:type="dxa" w:w="3888"/>
+            <w:shd w:val="clear" w:color="auto" w:fill="F0F6FA"/>
+            <w:vAlign w:val="top"/>
+          </w:tcPr>
+          <w:p>
+            <w:pPr>
+              <w:spacing w:before="40" w:after="20"/>
+            </w:pPr>
+            <w:r>
+              <w:rPr>
+                <w:rFonts w:ascii="Calibri" w:hAnsi="Calibri"/>
+                <w:b/>
+                <w:i w:val="0"/>
+                <w:color w:val="007A87"/>
+                <w:sz w:val="18"/>
+              </w:rPr>
+              <w:t>Example</w:t>
+            </w:r>
+          </w:p>
+          <w:p>
+            <w:pPr>
+              <w:spacing w:before="0" w:after="0"/>
+            </w:pPr>
+            <w:r>
+              <w:rPr>
+                <w:rFonts w:ascii="Calibri" w:hAnsi="Calibri"/>
+                <w:b/>
+                <w:i w:val="0"/>
+                <w:color w:val="1A3A5C"/>
+                <w:sz w:val="22"/>
+              </w:rPr>
+              <w:t>あ  __  う  __  お</w:t>
+            </w:r>
+          </w:p>
+          <w:p>
+            <w:pPr>
+              <w:spacing w:before="0" w:after="40"/>
+            </w:pPr>
+            <w:r>
+              <w:rPr>
+                <w:rFonts w:ascii="Calibri" w:hAnsi="Calibri"/>
+                <w:b w:val="0"/>
+                <w:i w:val="0"/>
+                <w:color w:val="1A1A2E"/>
+                <w:sz w:val="18"/>
+              </w:rPr>
+              <w:t>Answer: い, え</w:t>
+            </w:r>
+          </w:p>
+        </w:tc>
+      </w:tr>
+    </w:tbl>
+    <w:p>
+      <w:pPr>
+        <w:spacing w:after="20"/>
+      </w:pPr>
     </w:p>
     <w:p>
       <w:pPr>
@@ -356,7 +553,52 @@
           <w:color w:val="FFFFFF"/>
           <w:sz w:val="24"/>
         </w:rPr>
-        <w:t>Sound Guide</w:t>
+        <w:t>Activity 1 — Write the Reading</w:t>
+      </w:r>
+    </w:p>
+    <w:p>
+      <w:pPr>
+        <w:spacing w:before="20" w:after="40"/>
+      </w:pPr>
+      <w:r>
+        <w:rPr>
+          <w:rFonts w:ascii="Calibri" w:hAnsi="Calibri"/>
+          <w:b w:val="0"/>
+          <w:i w:val="0"/>
+          <w:color w:val="1A1A2E"/>
+          <w:sz w:val="20"/>
+        </w:rPr>
+        <w:t xml:space="preserve">Look at each kana and </w:t>
+      </w:r>
+      <w:r>
+        <w:rPr>
+          <w:rFonts w:ascii="Calibri" w:hAnsi="Calibri"/>
+          <w:b/>
+          <w:i w:val="0"/>
+          <w:color w:val="007A87"/>
+          <w:sz w:val="20"/>
+        </w:rPr>
+        <w:t>write its reading in romaji</w:t>
+      </w:r>
+      <w:r>
+        <w:rPr>
+          <w:rFonts w:ascii="Calibri" w:hAnsi="Calibri"/>
+          <w:b w:val="0"/>
+          <w:i w:val="0"/>
+          <w:color w:val="1A1A2E"/>
+          <w:sz w:val="20"/>
+        </w:rPr>
+        <w:t xml:space="preserve">. Example: </w:t>
+      </w:r>
+      <w:r>
+        <w:rPr>
+          <w:rFonts w:ascii="Calibri" w:hAnsi="Calibri"/>
+          <w:b/>
+          <w:i w:val="0"/>
+          <w:color w:val="1A3A5C"/>
+          <w:sz w:val="20"/>
+        </w:rPr>
+        <w:t>あ = a</w:t>
       </w:r>
     </w:p>
     <w:tbl>
@@ -371,6 +613,29 @@
         <w:gridCol w:w="3888"/>
       </w:tblGrid>
       <w:tr>
+        <w:tc>
+          <w:tcPr>
+            <w:tcW w:type="dxa" w:w="3888"/>
+            <w:shd w:val="clear" w:color="auto" w:fill="1A3A5C"/>
+            <w:vAlign w:val="center"/>
+          </w:tcPr>
+          <w:p>
+            <w:pPr>
+              <w:spacing w:before="40" w:after="40"/>
+              <w:jc w:val="center"/>
+            </w:pPr>
+            <w:r>
+              <w:rPr>
+                <w:rFonts w:ascii="Calibri" w:hAnsi="Calibri"/>
+                <w:b/>
+                <w:i w:val="0"/>
+                <w:color w:val="FFFFFF"/>
+                <w:sz w:val="20"/>
+              </w:rPr>
+              <w:t>#</w:t>
+            </w:r>
+          </w:p>
+        </w:tc>
         <w:tc>
           <w:tcPr>
             <w:tcW w:type="dxa" w:w="3888"/>
@@ -413,14 +678,16 @@
                 <w:color w:val="FFFFFF"/>
                 <w:sz w:val="20"/>
               </w:rPr>
-              <w:t>Sound</w:t>
+              <w:t>Your reading</w:t>
             </w:r>
           </w:p>
         </w:tc>
+      </w:tr>
+      <w:tr>
         <w:tc>
           <w:tcPr>
             <w:tcW w:type="dxa" w:w="3888"/>
-            <w:shd w:val="clear" w:color="auto" w:fill="1A3A5C"/>
+            <w:shd w:val="clear" w:color="auto" w:fill="F0F6FA"/>
             <w:vAlign w:val="center"/>
           </w:tcPr>
           <w:p>
@@ -433,15 +700,13 @@
                 <w:rFonts w:ascii="Calibri" w:hAnsi="Calibri"/>
                 <w:b/>
                 <w:i w:val="0"/>
-                <w:color w:val="FFFFFF"/>
-                <w:sz w:val="20"/>
+                <w:color w:val="6B7B8D"/>
+                <w:sz w:val="18"/>
               </w:rPr>
-              <w:t>Beginner tip</w:t>
+              <w:t>1</w:t>
             </w:r>
           </w:p>
         </w:tc>
-      </w:tr>
-      <w:tr>
         <w:tc>
           <w:tcPr>
             <w:tcW w:type="dxa" w:w="3888"/>
@@ -479,39 +744,40 @@
             <w:r>
               <w:rPr>
                 <w:rFonts w:ascii="Calibri" w:hAnsi="Calibri"/>
-                <w:b/>
+                <w:b w:val="0"/>
                 <w:i w:val="0"/>
-                <w:color w:val="007A87"/>
-                <w:sz w:val="22"/>
+                <w:color w:val="1A1A2E"/>
+                <w:sz w:val="20"/>
               </w:rPr>
-              <w:t>a</w:t>
+              <w:t>__________________</w:t>
             </w:r>
           </w:p>
         </w:tc>
+      </w:tr>
+      <w:tr>
         <w:tc>
           <w:tcPr>
             <w:tcW w:type="dxa" w:w="3888"/>
-            <w:shd w:val="clear" w:color="auto" w:fill="F0F6FA"/>
+            <w:shd w:val="clear" w:color="auto" w:fill="FFFFFF"/>
             <w:vAlign w:val="center"/>
           </w:tcPr>
           <w:p>
             <w:pPr>
               <w:spacing w:before="40" w:after="40"/>
+              <w:jc w:val="center"/>
             </w:pPr>
             <w:r>
               <w:rPr>
                 <w:rFonts w:ascii="Calibri" w:hAnsi="Calibri"/>
-                <w:b w:val="0"/>
+                <w:b/>
                 <w:i w:val="0"/>
-                <w:color w:val="1A1A2E"/>
+                <w:color w:val="6B7B8D"/>
                 <w:sz w:val="18"/>
               </w:rPr>
-              <w:t>Open and clear, like a in father.</w:t>
+              <w:t>2</w:t>
             </w:r>
           </w:p>
         </w:tc>
-      </w:tr>
-      <w:tr>
         <w:tc>
           <w:tcPr>
             <w:tcW w:type="dxa" w:w="3888"/>
@@ -549,39 +815,40 @@
             <w:r>
               <w:rPr>
                 <w:rFonts w:ascii="Calibri" w:hAnsi="Calibri"/>
-                <w:b/>
+                <w:b w:val="0"/>
                 <w:i w:val="0"/>
-                <w:color w:val="007A87"/>
-                <w:sz w:val="22"/>
+                <w:color w:val="1A1A2E"/>
+                <w:sz w:val="20"/>
               </w:rPr>
-              <w:t>i</w:t>
+              <w:t>__________________</w:t>
             </w:r>
           </w:p>
         </w:tc>
+      </w:tr>
+      <w:tr>
         <w:tc>
           <w:tcPr>
             <w:tcW w:type="dxa" w:w="3888"/>
-            <w:shd w:val="clear" w:color="auto" w:fill="FFFFFF"/>
+            <w:shd w:val="clear" w:color="auto" w:fill="F0F6FA"/>
             <w:vAlign w:val="center"/>
           </w:tcPr>
           <w:p>
             <w:pPr>
               <w:spacing w:before="40" w:after="40"/>
+              <w:jc w:val="center"/>
             </w:pPr>
             <w:r>
               <w:rPr>
                 <w:rFonts w:ascii="Calibri" w:hAnsi="Calibri"/>
-                <w:b w:val="0"/>
+                <w:b/>
                 <w:i w:val="0"/>
-                <w:color w:val="1A1A2E"/>
+                <w:color w:val="6B7B8D"/>
                 <w:sz w:val="18"/>
               </w:rPr>
-              <w:t>Short i, like ee in see.</w:t>
+              <w:t>3</w:t>
             </w:r>
           </w:p>
         </w:tc>
-      </w:tr>
-      <w:tr>
         <w:tc>
           <w:tcPr>
             <w:tcW w:type="dxa" w:w="3888"/>
@@ -619,39 +886,40 @@
             <w:r>
               <w:rPr>
                 <w:rFonts w:ascii="Calibri" w:hAnsi="Calibri"/>
-                <w:b/>
+                <w:b w:val="0"/>
                 <w:i w:val="0"/>
-                <w:color w:val="007A87"/>
-                <w:sz w:val="22"/>
+                <w:color w:val="1A1A2E"/>
+                <w:sz w:val="20"/>
               </w:rPr>
-              <w:t>u</w:t>
+              <w:t>__________________</w:t>
             </w:r>
           </w:p>
         </w:tc>
+      </w:tr>
+      <w:tr>
         <w:tc>
           <w:tcPr>
             <w:tcW w:type="dxa" w:w="3888"/>
-            <w:shd w:val="clear" w:color="auto" w:fill="F0F6FA"/>
+            <w:shd w:val="clear" w:color="auto" w:fill="FFFFFF"/>
             <w:vAlign w:val="center"/>
           </w:tcPr>
           <w:p>
             <w:pPr>
               <w:spacing w:before="40" w:after="40"/>
+              <w:jc w:val="center"/>
             </w:pPr>
             <w:r>
               <w:rPr>
                 <w:rFonts w:ascii="Calibri" w:hAnsi="Calibri"/>
-                <w:b w:val="0"/>
+                <w:b/>
                 <w:i w:val="0"/>
-                <w:color w:val="1A1A2E"/>
+                <w:color w:val="6B7B8D"/>
                 <w:sz w:val="18"/>
               </w:rPr>
-              <w:t>Short u, with rounded lips.</w:t>
+              <w:t>4</w:t>
             </w:r>
           </w:p>
         </w:tc>
-      </w:tr>
-      <w:tr>
         <w:tc>
           <w:tcPr>
             <w:tcW w:type="dxa" w:w="3888"/>
@@ -689,39 +957,40 @@
             <w:r>
               <w:rPr>
                 <w:rFonts w:ascii="Calibri" w:hAnsi="Calibri"/>
-                <w:b/>
+                <w:b w:val="0"/>
                 <w:i w:val="0"/>
-                <w:color w:val="007A87"/>
-                <w:sz w:val="22"/>
+                <w:color w:val="1A1A2E"/>
+                <w:sz w:val="20"/>
               </w:rPr>
-              <w:t>e</w:t>
+              <w:t>__________________</w:t>
             </w:r>
           </w:p>
         </w:tc>
+      </w:tr>
+      <w:tr>
         <w:tc>
           <w:tcPr>
             <w:tcW w:type="dxa" w:w="3888"/>
-            <w:shd w:val="clear" w:color="auto" w:fill="FFFFFF"/>
+            <w:shd w:val="clear" w:color="auto" w:fill="F0F6FA"/>
             <w:vAlign w:val="center"/>
           </w:tcPr>
           <w:p>
             <w:pPr>
               <w:spacing w:before="40" w:after="40"/>
+              <w:jc w:val="center"/>
             </w:pPr>
             <w:r>
               <w:rPr>
                 <w:rFonts w:ascii="Calibri" w:hAnsi="Calibri"/>
-                <w:b w:val="0"/>
+                <w:b/>
                 <w:i w:val="0"/>
-                <w:color w:val="1A1A2E"/>
+                <w:color w:val="6B7B8D"/>
                 <w:sz w:val="18"/>
               </w:rPr>
-              <w:t>Short e, like e in bed.</w:t>
+              <w:t>5</w:t>
             </w:r>
           </w:p>
         </w:tc>
-      </w:tr>
-      <w:tr>
         <w:tc>
           <w:tcPr>
             <w:tcW w:type="dxa" w:w="3888"/>
@@ -759,34 +1028,12 @@
             <w:r>
               <w:rPr>
                 <w:rFonts w:ascii="Calibri" w:hAnsi="Calibri"/>
-                <w:b/>
-                <w:i w:val="0"/>
-                <w:color w:val="007A87"/>
-                <w:sz w:val="22"/>
-              </w:rPr>
-              <w:t>o</w:t>
-            </w:r>
-          </w:p>
-        </w:tc>
-        <w:tc>
-          <w:tcPr>
-            <w:tcW w:type="dxa" w:w="3888"/>
-            <w:shd w:val="clear" w:color="auto" w:fill="F0F6FA"/>
-            <w:vAlign w:val="center"/>
-          </w:tcPr>
-          <w:p>
-            <w:pPr>
-              <w:spacing w:before="40" w:after="40"/>
-            </w:pPr>
-            <w:r>
-              <w:rPr>
-                <w:rFonts w:ascii="Calibri" w:hAnsi="Calibri"/>
                 <w:b w:val="0"/>
                 <w:i w:val="0"/>
                 <w:color w:val="1A1A2E"/>
-                <w:sz w:val="18"/>
+                <w:sz w:val="20"/>
               </w:rPr>
-              <w:t>Short o, like o in open.</w:t>
+              <w:t>__________________</w:t>
             </w:r>
           </w:p>
         </w:tc>
@@ -801,7 +1048,7 @@
       <w:pPr>
         <w:spacing w:before="60" w:after="40"/>
         <w:ind w:left="170"/>
-        <w:shd w:val="clear" w:color="auto" w:fill="007A87"/>
+        <w:shd w:val="clear" w:color="auto" w:fill="1A3A5C"/>
       </w:pPr>
       <w:r>
         <w:rPr>
@@ -811,7 +1058,62 @@
           <w:color w:val="FFFFFF"/>
           <w:sz w:val="24"/>
         </w:rPr>
-        <w:t>Part 1 — Match the Sound</w:t>
+        <w:t>Activity 2 — Pattern Practice</w:t>
+      </w:r>
+    </w:p>
+    <w:p>
+      <w:pPr>
+        <w:spacing w:before="20" w:after="40"/>
+      </w:pPr>
+      <w:r>
+        <w:rPr>
+          <w:rFonts w:ascii="Calibri" w:hAnsi="Calibri"/>
+          <w:b w:val="0"/>
+          <w:i w:val="0"/>
+          <w:color w:val="1A1A2E"/>
+          <w:sz w:val="20"/>
+        </w:rPr>
+        <w:t xml:space="preserve">Use the row pattern to help you. </w:t>
+      </w:r>
+      <w:r>
+        <w:rPr>
+          <w:rFonts w:ascii="Calibri" w:hAnsi="Calibri"/>
+          <w:b/>
+          <w:i w:val="0"/>
+          <w:color w:val="007A87"/>
+          <w:sz w:val="20"/>
+        </w:rPr>
+        <w:t>Fill in the missing kana</w:t>
+      </w:r>
+      <w:r>
+        <w:rPr>
+          <w:rFonts w:ascii="Calibri" w:hAnsi="Calibri"/>
+          <w:b w:val="0"/>
+          <w:i w:val="0"/>
+          <w:color w:val="1A1A2E"/>
+          <w:sz w:val="20"/>
+        </w:rPr>
+        <w:t xml:space="preserve"> and </w:t>
+      </w:r>
+      <w:r>
+        <w:rPr>
+          <w:rFonts w:ascii="Calibri" w:hAnsi="Calibri"/>
+          <w:b/>
+          <w:i w:val="0"/>
+          <w:color w:val="1A3A5C"/>
+          <w:sz w:val="20"/>
+        </w:rPr>
+        <w:t>circle the one that does not belong</w:t>
+      </w:r>
+      <w:r>
+        <w:rPr>
+          <w:rFonts w:ascii="Calibri" w:hAnsi="Calibri"/>
+          <w:b w:val="0"/>
+          <w:i w:val="0"/>
+          <w:color w:val="1A1A2E"/>
+          <w:sz w:val="20"/>
+        </w:rPr>
+        <w:t>.</w:t>
       </w:r>
     </w:p>
     <w:tbl>
@@ -821,17 +1123,14 @@
         <w:tblLook w:firstColumn="1" w:firstRow="1" w:lastColumn="0" w:lastRow="0" w:noHBand="0" w:noVBand="1" w:val="04A0"/>
       </w:tblPr>
       <w:tblGrid>
-        <w:gridCol w:w="2333"/>
-        <w:gridCol w:w="2333"/>
-        <w:gridCol w:w="2333"/>
-        <w:gridCol w:w="2333"/>
-        <w:gridCol w:w="2333"/>
+        <w:gridCol w:w="5832"/>
+        <w:gridCol w:w="5832"/>
       </w:tblGrid>
       <w:tr>
         <w:tc>
           <w:tcPr>
-            <w:tcW w:type="dxa" w:w="2333"/>
-            <w:shd w:val="clear" w:color="auto" w:fill="F0F6FA"/>
+            <w:tcW w:type="dxa" w:w="5832"/>
+            <w:shd w:val="clear" w:color="auto" w:fill="007A87"/>
             <w:vAlign w:val="center"/>
           </w:tcPr>
           <w:p>
@@ -844,27 +1143,17 @@
                 <w:rFonts w:ascii="Calibri" w:hAnsi="Calibri"/>
                 <w:b/>
                 <w:i w:val="0"/>
-                <w:color w:val="007A87"/>
+                <w:color w:val="FFFFFF"/>
                 <w:sz w:val="20"/>
               </w:rPr>
-              <w:t xml:space="preserve">A. </w:t>
-            </w:r>
-            <w:r>
-              <w:rPr>
-                <w:rFonts w:ascii="Calibri" w:hAnsi="Calibri"/>
-                <w:b w:val="0"/>
-                <w:i w:val="0"/>
-                <w:color w:val="1A1A2E"/>
-                <w:sz w:val="18"/>
-              </w:rPr>
-              <w:t>i</w:t>
+              <w:t>Fill in the missing kana</w:t>
             </w:r>
           </w:p>
         </w:tc>
         <w:tc>
           <w:tcPr>
-            <w:tcW w:type="dxa" w:w="2333"/>
-            <w:shd w:val="clear" w:color="auto" w:fill="F0F6FA"/>
+            <w:tcW w:type="dxa" w:w="5832"/>
+            <w:shd w:val="clear" w:color="auto" w:fill="007A87"/>
             <w:vAlign w:val="center"/>
           </w:tcPr>
           <w:p>
@@ -877,134 +1166,14 @@
                 <w:rFonts w:ascii="Calibri" w:hAnsi="Calibri"/>
                 <w:b/>
                 <w:i w:val="0"/>
-                <w:color w:val="007A87"/>
+                <w:color w:val="FFFFFF"/>
                 <w:sz w:val="20"/>
               </w:rPr>
-              <w:t xml:space="preserve">B. </w:t>
-            </w:r>
-            <w:r>
-              <w:rPr>
-                <w:rFonts w:ascii="Calibri" w:hAnsi="Calibri"/>
-                <w:b w:val="0"/>
-                <w:i w:val="0"/>
-                <w:color w:val="1A1A2E"/>
-                <w:sz w:val="18"/>
-              </w:rPr>
-              <w:t>u</w:t>
-            </w:r>
-          </w:p>
-        </w:tc>
-        <w:tc>
-          <w:tcPr>
-            <w:tcW w:type="dxa" w:w="2333"/>
-            <w:shd w:val="clear" w:color="auto" w:fill="F0F6FA"/>
-            <w:vAlign w:val="center"/>
-          </w:tcPr>
-          <w:p>
-            <w:pPr>
-              <w:spacing w:before="40" w:after="40"/>
-              <w:jc w:val="center"/>
-            </w:pPr>
-            <w:r>
-              <w:rPr>
-                <w:rFonts w:ascii="Calibri" w:hAnsi="Calibri"/>
-                <w:b/>
-                <w:i w:val="0"/>
-                <w:color w:val="007A87"/>
-                <w:sz w:val="20"/>
-              </w:rPr>
-              <w:t xml:space="preserve">C. </w:t>
-            </w:r>
-            <w:r>
-              <w:rPr>
-                <w:rFonts w:ascii="Calibri" w:hAnsi="Calibri"/>
-                <w:b w:val="0"/>
-                <w:i w:val="0"/>
-                <w:color w:val="1A1A2E"/>
-                <w:sz w:val="18"/>
-              </w:rPr>
-              <w:t>e</w:t>
-            </w:r>
-          </w:p>
-        </w:tc>
-        <w:tc>
-          <w:tcPr>
-            <w:tcW w:type="dxa" w:w="2333"/>
-            <w:shd w:val="clear" w:color="auto" w:fill="F0F6FA"/>
-            <w:vAlign w:val="center"/>
-          </w:tcPr>
-          <w:p>
-            <w:pPr>
-              <w:spacing w:before="40" w:after="40"/>
-              <w:jc w:val="center"/>
-            </w:pPr>
-            <w:r>
-              <w:rPr>
-                <w:rFonts w:ascii="Calibri" w:hAnsi="Calibri"/>
-                <w:b/>
-                <w:i w:val="0"/>
-                <w:color w:val="007A87"/>
-                <w:sz w:val="20"/>
-              </w:rPr>
-              <w:t xml:space="preserve">D. </w:t>
-            </w:r>
-            <w:r>
-              <w:rPr>
-                <w:rFonts w:ascii="Calibri" w:hAnsi="Calibri"/>
-                <w:b w:val="0"/>
-                <w:i w:val="0"/>
-                <w:color w:val="1A1A2E"/>
-                <w:sz w:val="18"/>
-              </w:rPr>
-              <w:t>o</w:t>
-            </w:r>
-          </w:p>
-        </w:tc>
-        <w:tc>
-          <w:tcPr>
-            <w:tcW w:type="dxa" w:w="2333"/>
-            <w:shd w:val="clear" w:color="auto" w:fill="F0F6FA"/>
-            <w:vAlign w:val="center"/>
-          </w:tcPr>
-          <w:p>
-            <w:pPr>
-              <w:spacing w:before="40" w:after="40"/>
-              <w:jc w:val="center"/>
-            </w:pPr>
-            <w:r>
-              <w:rPr>
-                <w:rFonts w:ascii="Calibri" w:hAnsi="Calibri"/>
-                <w:b/>
-                <w:i w:val="0"/>
-                <w:color w:val="007A87"/>
-                <w:sz w:val="20"/>
-              </w:rPr>
-              <w:t xml:space="preserve">E. </w:t>
-            </w:r>
-            <w:r>
-              <w:rPr>
-                <w:rFonts w:ascii="Calibri" w:hAnsi="Calibri"/>
-                <w:b w:val="0"/>
-                <w:i w:val="0"/>
-                <w:color w:val="1A1A2E"/>
-                <w:sz w:val="18"/>
-              </w:rPr>
-              <w:t>a</w:t>
+              <w:t>Your answer</w:t>
             </w:r>
           </w:p>
         </w:tc>
       </w:tr>
-    </w:tbl>
-    <w:tbl>
-      <w:tblPr>
-        <w:tblStyle w:val="TableGrid"/>
-        <w:tblW w:type="auto" w:w="0"/>
-        <w:tblLook w:firstColumn="1" w:firstRow="1" w:lastColumn="0" w:lastRow="0" w:noHBand="0" w:noVBand="1" w:val="04A0"/>
-      </w:tblPr>
-      <w:tblGrid>
-        <w:gridCol w:w="5832"/>
-        <w:gridCol w:w="5832"/>
-      </w:tblGrid>
       <w:tr>
         <w:tc>
           <w:tcPr>
@@ -1023,9 +1192,9 @@
                 <w:b/>
                 <w:i w:val="0"/>
                 <w:color w:val="1A3A5C"/>
-                <w:sz w:val="28"/>
+                <w:sz w:val="24"/>
               </w:rPr>
-              <w:t>あ</w:t>
+              <w:t>あ  __  う  __  お</w:t>
             </w:r>
           </w:p>
         </w:tc>
@@ -1038,17 +1207,8 @@
           <w:p>
             <w:pPr>
               <w:spacing w:before="40" w:after="40"/>
+              <w:jc w:val="center"/>
             </w:pPr>
-            <w:r>
-              <w:rPr>
-                <w:rFonts w:ascii="Calibri" w:hAnsi="Calibri"/>
-                <w:b/>
-                <w:i w:val="0"/>
-                <w:color w:val="007A87"/>
-                <w:sz w:val="20"/>
-              </w:rPr>
-              <w:t xml:space="preserve">Letter: </w:t>
-            </w:r>
             <w:r>
               <w:rPr>
                 <w:rFonts w:ascii="Calibri" w:hAnsi="Calibri"/>
@@ -1057,7 +1217,7 @@
                 <w:color w:val="1A1A2E"/>
                 <w:sz w:val="20"/>
               </w:rPr>
-              <w:t>____</w:t>
+              <w:t>__________________</w:t>
             </w:r>
           </w:p>
         </w:tc>
@@ -1080,9 +1240,9 @@
                 <w:b/>
                 <w:i w:val="0"/>
                 <w:color w:val="1A3A5C"/>
-                <w:sz w:val="28"/>
+                <w:sz w:val="24"/>
               </w:rPr>
-              <w:t>い</w:t>
+              <w:t>__  い  __  え  __</w:t>
             </w:r>
           </w:p>
         </w:tc>
@@ -1095,17 +1255,8 @@
           <w:p>
             <w:pPr>
               <w:spacing w:before="40" w:after="40"/>
+              <w:jc w:val="center"/>
             </w:pPr>
-            <w:r>
-              <w:rPr>
-                <w:rFonts w:ascii="Calibri" w:hAnsi="Calibri"/>
-                <w:b/>
-                <w:i w:val="0"/>
-                <w:color w:val="007A87"/>
-                <w:sz w:val="20"/>
-              </w:rPr>
-              <w:t xml:space="preserve">Letter: </w:t>
-            </w:r>
             <w:r>
               <w:rPr>
                 <w:rFonts w:ascii="Calibri" w:hAnsi="Calibri"/>
@@ -1114,7 +1265,66 @@
                 <w:color w:val="1A1A2E"/>
                 <w:sz w:val="20"/>
               </w:rPr>
-              <w:t>____</w:t>
+              <w:t>__________________</w:t>
+            </w:r>
+          </w:p>
+        </w:tc>
+      </w:tr>
+    </w:tbl>
+    <w:tbl>
+      <w:tblPr>
+        <w:tblStyle w:val="TableGrid"/>
+        <w:tblW w:type="auto" w:w="0"/>
+        <w:tblLook w:firstColumn="1" w:firstRow="1" w:lastColumn="0" w:lastRow="0" w:noHBand="0" w:noVBand="1" w:val="04A0"/>
+      </w:tblPr>
+      <w:tblGrid>
+        <w:gridCol w:w="5832"/>
+        <w:gridCol w:w="5832"/>
+      </w:tblGrid>
+      <w:tr>
+        <w:tc>
+          <w:tcPr>
+            <w:tcW w:type="dxa" w:w="5832"/>
+            <w:shd w:val="clear" w:color="auto" w:fill="1A3A5C"/>
+            <w:vAlign w:val="center"/>
+          </w:tcPr>
+          <w:p>
+            <w:pPr>
+              <w:spacing w:before="40" w:after="40"/>
+              <w:jc w:val="center"/>
+            </w:pPr>
+            <w:r>
+              <w:rPr>
+                <w:rFonts w:ascii="Calibri" w:hAnsi="Calibri"/>
+                <w:b/>
+                <w:i w:val="0"/>
+                <w:color w:val="FFFFFF"/>
+                <w:sz w:val="20"/>
+              </w:rPr>
+              <w:t>Circle the kana that does not belong</w:t>
+            </w:r>
+          </w:p>
+        </w:tc>
+        <w:tc>
+          <w:tcPr>
+            <w:tcW w:type="dxa" w:w="5832"/>
+            <w:shd w:val="clear" w:color="auto" w:fill="1A3A5C"/>
+            <w:vAlign w:val="center"/>
+          </w:tcPr>
+          <w:p>
+            <w:pPr>
+              <w:spacing w:before="40" w:after="40"/>
+              <w:jc w:val="center"/>
+            </w:pPr>
+            <w:r>
+              <w:rPr>
+                <w:rFonts w:ascii="Calibri" w:hAnsi="Calibri"/>
+                <w:b/>
+                <w:i w:val="0"/>
+                <w:color w:val="FFFFFF"/>
+                <w:sz w:val="20"/>
+              </w:rPr>
+              <w:t>Your answer</w:t>
             </w:r>
           </w:p>
         </w:tc>
@@ -1123,7 +1333,7 @@
         <w:tc>
           <w:tcPr>
             <w:tcW w:type="dxa" w:w="5832"/>
-            <w:shd w:val="clear" w:color="auto" w:fill="F0F6FA"/>
+            <w:shd w:val="clear" w:color="auto" w:fill="D4F1F4"/>
             <w:vAlign w:val="center"/>
           </w:tcPr>
           <w:p>
@@ -1137,32 +1347,23 @@
                 <w:b/>
                 <w:i w:val="0"/>
                 <w:color w:val="1A3A5C"/>
-                <w:sz w:val="28"/>
+                <w:sz w:val="24"/>
               </w:rPr>
-              <w:t>う</w:t>
+              <w:t>か   あ   い   う</w:t>
             </w:r>
           </w:p>
         </w:tc>
         <w:tc>
           <w:tcPr>
             <w:tcW w:type="dxa" w:w="5832"/>
-            <w:shd w:val="clear" w:color="auto" w:fill="F0F6FA"/>
+            <w:shd w:val="clear" w:color="auto" w:fill="D4F1F4"/>
             <w:vAlign w:val="center"/>
           </w:tcPr>
           <w:p>
             <w:pPr>
               <w:spacing w:before="40" w:after="40"/>
+              <w:jc w:val="center"/>
             </w:pPr>
-            <w:r>
-              <w:rPr>
-                <w:rFonts w:ascii="Calibri" w:hAnsi="Calibri"/>
-                <w:b/>
-                <w:i w:val="0"/>
-                <w:color w:val="007A87"/>
-                <w:sz w:val="20"/>
-              </w:rPr>
-              <w:t xml:space="preserve">Letter: </w:t>
-            </w:r>
             <w:r>
               <w:rPr>
                 <w:rFonts w:ascii="Calibri" w:hAnsi="Calibri"/>
@@ -1171,7 +1372,7 @@
                 <w:color w:val="1A1A2E"/>
                 <w:sz w:val="20"/>
               </w:rPr>
-              <w:t>____</w:t>
+              <w:t>________</w:t>
             </w:r>
           </w:p>
         </w:tc>
@@ -1194,9 +1395,9 @@
                 <w:b/>
                 <w:i w:val="0"/>
                 <w:color w:val="1A3A5C"/>
-                <w:sz w:val="28"/>
+                <w:sz w:val="24"/>
               </w:rPr>
-              <w:t>え</w:t>
+              <w:t>い   き   う   え</w:t>
             </w:r>
           </w:p>
         </w:tc>
@@ -1209,17 +1410,8 @@
           <w:p>
             <w:pPr>
               <w:spacing w:before="40" w:after="40"/>
+              <w:jc w:val="center"/>
             </w:pPr>
-            <w:r>
-              <w:rPr>
-                <w:rFonts w:ascii="Calibri" w:hAnsi="Calibri"/>
-                <w:b/>
-                <w:i w:val="0"/>
-                <w:color w:val="007A87"/>
-                <w:sz w:val="20"/>
-              </w:rPr>
-              <w:t xml:space="preserve">Letter: </w:t>
-            </w:r>
             <w:r>
               <w:rPr>
                 <w:rFonts w:ascii="Calibri" w:hAnsi="Calibri"/>
@@ -1228,7 +1420,7 @@
                 <w:color w:val="1A1A2E"/>
                 <w:sz w:val="20"/>
               </w:rPr>
-              <w:t>____</w:t>
+              <w:t>________</w:t>
             </w:r>
           </w:p>
         </w:tc>
@@ -1237,7 +1429,7 @@
         <w:tc>
           <w:tcPr>
             <w:tcW w:type="dxa" w:w="5832"/>
-            <w:shd w:val="clear" w:color="auto" w:fill="F0F6FA"/>
+            <w:shd w:val="clear" w:color="auto" w:fill="D4F1F4"/>
             <w:vAlign w:val="center"/>
           </w:tcPr>
           <w:p>
@@ -1251,32 +1443,23 @@
                 <w:b/>
                 <w:i w:val="0"/>
                 <w:color w:val="1A3A5C"/>
-                <w:sz w:val="28"/>
+                <w:sz w:val="24"/>
               </w:rPr>
-              <w:t>お</w:t>
+              <w:t>う   え   く   お</w:t>
             </w:r>
           </w:p>
         </w:tc>
         <w:tc>
           <w:tcPr>
             <w:tcW w:type="dxa" w:w="5832"/>
-            <w:shd w:val="clear" w:color="auto" w:fill="F0F6FA"/>
+            <w:shd w:val="clear" w:color="auto" w:fill="D4F1F4"/>
             <w:vAlign w:val="center"/>
           </w:tcPr>
           <w:p>
             <w:pPr>
               <w:spacing w:before="40" w:after="40"/>
+              <w:jc w:val="center"/>
             </w:pPr>
-            <w:r>
-              <w:rPr>
-                <w:rFonts w:ascii="Calibri" w:hAnsi="Calibri"/>
-                <w:b/>
-                <w:i w:val="0"/>
-                <w:color w:val="007A87"/>
-                <w:sz w:val="20"/>
-              </w:rPr>
-              <w:t xml:space="preserve">Letter: </w:t>
-            </w:r>
             <w:r>
               <w:rPr>
                 <w:rFonts w:ascii="Calibri" w:hAnsi="Calibri"/>
@@ -1285,7 +1468,7 @@
                 <w:color w:val="1A1A2E"/>
                 <w:sz w:val="20"/>
               </w:rPr>
-              <w:t>____</w:t>
+              <w:t>________</w:t>
             </w:r>
           </w:p>
         </w:tc>
@@ -1329,7 +1512,7 @@
           <w:color w:val="FFFFFF"/>
           <w:sz w:val="24"/>
         </w:rPr>
-        <w:t>Part 2 — Read and Check</w:t>
+        <w:t>Reference &amp; Answer Key</w:t>
       </w:r>
     </w:p>
     <w:p>
@@ -1617,7 +1800,7 @@
           <w:color w:val="FFFFFF"/>
           <w:sz w:val="24"/>
         </w:rPr>
-        <w:t>Part 1 Answer Key</w:t>
+        <w:t>Activity 1 Answers</w:t>
       </w:r>
     </w:p>
     <w:tbl>
@@ -1627,14 +1810,13 @@
         <w:tblLook w:firstColumn="1" w:firstRow="1" w:lastColumn="0" w:lastRow="0" w:noHBand="0" w:noVBand="1" w:val="04A0"/>
       </w:tblPr>
       <w:tblGrid>
-        <w:gridCol w:w="3888"/>
-        <w:gridCol w:w="3888"/>
-        <w:gridCol w:w="3888"/>
+        <w:gridCol w:w="5832"/>
+        <w:gridCol w:w="5832"/>
       </w:tblGrid>
       <w:tr>
         <w:tc>
           <w:tcPr>
-            <w:tcW w:type="dxa" w:w="3888"/>
+            <w:tcW w:type="dxa" w:w="5832"/>
             <w:shd w:val="clear" w:color="auto" w:fill="007A87"/>
             <w:vAlign w:val="center"/>
           </w:tcPr>
@@ -1657,7 +1839,7 @@
         </w:tc>
         <w:tc>
           <w:tcPr>
-            <w:tcW w:type="dxa" w:w="3888"/>
+            <w:tcW w:type="dxa" w:w="5832"/>
             <w:shd w:val="clear" w:color="auto" w:fill="007A87"/>
             <w:vAlign w:val="center"/>
           </w:tcPr>
@@ -1674,30 +1856,7 @@
                 <w:color w:val="FFFFFF"/>
                 <w:sz w:val="20"/>
               </w:rPr>
-              <w:t>Correct letter</w:t>
-            </w:r>
-          </w:p>
-        </w:tc>
-        <w:tc>
-          <w:tcPr>
-            <w:tcW w:type="dxa" w:w="3888"/>
-            <w:shd w:val="clear" w:color="auto" w:fill="007A87"/>
-            <w:vAlign w:val="center"/>
-          </w:tcPr>
-          <w:p>
-            <w:pPr>
-              <w:spacing w:before="40" w:after="40"/>
-              <w:jc w:val="center"/>
-            </w:pPr>
-            <w:r>
-              <w:rPr>
-                <w:rFonts w:ascii="Calibri" w:hAnsi="Calibri"/>
-                <w:b/>
-                <w:i w:val="0"/>
-                <w:color w:val="FFFFFF"/>
-                <w:sz w:val="20"/>
-              </w:rPr>
-              <w:t>Sound</w:t>
+              <w:t>Reading</w:t>
             </w:r>
           </w:p>
         </w:tc>
@@ -1705,7 +1864,7 @@
       <w:tr>
         <w:tc>
           <w:tcPr>
-            <w:tcW w:type="dxa" w:w="3888"/>
+            <w:tcW w:type="dxa" w:w="5832"/>
             <w:shd w:val="clear" w:color="auto" w:fill="D4F1F4"/>
             <w:vAlign w:val="center"/>
           </w:tcPr>
@@ -1728,30 +1887,7 @@
         </w:tc>
         <w:tc>
           <w:tcPr>
-            <w:tcW w:type="dxa" w:w="3888"/>
-            <w:shd w:val="clear" w:color="auto" w:fill="D4F1F4"/>
-            <w:vAlign w:val="center"/>
-          </w:tcPr>
-          <w:p>
-            <w:pPr>
-              <w:spacing w:before="40" w:after="40"/>
-              <w:jc w:val="center"/>
-            </w:pPr>
-            <w:r>
-              <w:rPr>
-                <w:rFonts w:ascii="Calibri" w:hAnsi="Calibri"/>
-                <w:b/>
-                <w:i w:val="0"/>
-                <w:color w:val="007A87"/>
-                <w:sz w:val="20"/>
-              </w:rPr>
-              <w:t>E</w:t>
-            </w:r>
-          </w:p>
-        </w:tc>
-        <w:tc>
-          <w:tcPr>
-            <w:tcW w:type="dxa" w:w="3888"/>
+            <w:tcW w:type="dxa" w:w="5832"/>
             <w:shd w:val="clear" w:color="auto" w:fill="D4F1F4"/>
             <w:vAlign w:val="center"/>
           </w:tcPr>
@@ -1776,7 +1912,7 @@
       <w:tr>
         <w:tc>
           <w:tcPr>
-            <w:tcW w:type="dxa" w:w="3888"/>
+            <w:tcW w:type="dxa" w:w="5832"/>
             <w:shd w:val="clear" w:color="auto" w:fill="FFFFFF"/>
             <w:vAlign w:val="center"/>
           </w:tcPr>
@@ -1799,30 +1935,7 @@
         </w:tc>
         <w:tc>
           <w:tcPr>
-            <w:tcW w:type="dxa" w:w="3888"/>
-            <w:shd w:val="clear" w:color="auto" w:fill="FFFFFF"/>
-            <w:vAlign w:val="center"/>
-          </w:tcPr>
-          <w:p>
-            <w:pPr>
-              <w:spacing w:before="40" w:after="40"/>
-              <w:jc w:val="center"/>
-            </w:pPr>
-            <w:r>
-              <w:rPr>
-                <w:rFonts w:ascii="Calibri" w:hAnsi="Calibri"/>
-                <w:b/>
-                <w:i w:val="0"/>
-                <w:color w:val="007A87"/>
-                <w:sz w:val="20"/>
-              </w:rPr>
-              <w:t>A</w:t>
-            </w:r>
-          </w:p>
-        </w:tc>
-        <w:tc>
-          <w:tcPr>
-            <w:tcW w:type="dxa" w:w="3888"/>
+            <w:tcW w:type="dxa" w:w="5832"/>
             <w:shd w:val="clear" w:color="auto" w:fill="FFFFFF"/>
             <w:vAlign w:val="center"/>
           </w:tcPr>
@@ -1847,7 +1960,7 @@
       <w:tr>
         <w:tc>
           <w:tcPr>
-            <w:tcW w:type="dxa" w:w="3888"/>
+            <w:tcW w:type="dxa" w:w="5832"/>
             <w:shd w:val="clear" w:color="auto" w:fill="D4F1F4"/>
             <w:vAlign w:val="center"/>
           </w:tcPr>
@@ -1870,30 +1983,7 @@
         </w:tc>
         <w:tc>
           <w:tcPr>
-            <w:tcW w:type="dxa" w:w="3888"/>
-            <w:shd w:val="clear" w:color="auto" w:fill="D4F1F4"/>
-            <w:vAlign w:val="center"/>
-          </w:tcPr>
-          <w:p>
-            <w:pPr>
-              <w:spacing w:before="40" w:after="40"/>
-              <w:jc w:val="center"/>
-            </w:pPr>
-            <w:r>
-              <w:rPr>
-                <w:rFonts w:ascii="Calibri" w:hAnsi="Calibri"/>
-                <w:b/>
-                <w:i w:val="0"/>
-                <w:color w:val="007A87"/>
-                <w:sz w:val="20"/>
-              </w:rPr>
-              <w:t>B</w:t>
-            </w:r>
-          </w:p>
-        </w:tc>
-        <w:tc>
-          <w:tcPr>
-            <w:tcW w:type="dxa" w:w="3888"/>
+            <w:tcW w:type="dxa" w:w="5832"/>
             <w:shd w:val="clear" w:color="auto" w:fill="D4F1F4"/>
             <w:vAlign w:val="center"/>
           </w:tcPr>
@@ -1918,7 +2008,7 @@
       <w:tr>
         <w:tc>
           <w:tcPr>
-            <w:tcW w:type="dxa" w:w="3888"/>
+            <w:tcW w:type="dxa" w:w="5832"/>
             <w:shd w:val="clear" w:color="auto" w:fill="FFFFFF"/>
             <w:vAlign w:val="center"/>
           </w:tcPr>
@@ -1941,30 +2031,7 @@
         </w:tc>
         <w:tc>
           <w:tcPr>
-            <w:tcW w:type="dxa" w:w="3888"/>
-            <w:shd w:val="clear" w:color="auto" w:fill="FFFFFF"/>
-            <w:vAlign w:val="center"/>
-          </w:tcPr>
-          <w:p>
-            <w:pPr>
-              <w:spacing w:before="40" w:after="40"/>
-              <w:jc w:val="center"/>
-            </w:pPr>
-            <w:r>
-              <w:rPr>
-                <w:rFonts w:ascii="Calibri" w:hAnsi="Calibri"/>
-                <w:b/>
-                <w:i w:val="0"/>
-                <w:color w:val="007A87"/>
-                <w:sz w:val="20"/>
-              </w:rPr>
-              <w:t>C</w:t>
-            </w:r>
-          </w:p>
-        </w:tc>
-        <w:tc>
-          <w:tcPr>
-            <w:tcW w:type="dxa" w:w="3888"/>
+            <w:tcW w:type="dxa" w:w="5832"/>
             <w:shd w:val="clear" w:color="auto" w:fill="FFFFFF"/>
             <w:vAlign w:val="center"/>
           </w:tcPr>
@@ -1989,7 +2056,7 @@
       <w:tr>
         <w:tc>
           <w:tcPr>
-            <w:tcW w:type="dxa" w:w="3888"/>
+            <w:tcW w:type="dxa" w:w="5832"/>
             <w:shd w:val="clear" w:color="auto" w:fill="D4F1F4"/>
             <w:vAlign w:val="center"/>
           </w:tcPr>
@@ -2012,30 +2079,7 @@
         </w:tc>
         <w:tc>
           <w:tcPr>
-            <w:tcW w:type="dxa" w:w="3888"/>
-            <w:shd w:val="clear" w:color="auto" w:fill="D4F1F4"/>
-            <w:vAlign w:val="center"/>
-          </w:tcPr>
-          <w:p>
-            <w:pPr>
-              <w:spacing w:before="40" w:after="40"/>
-              <w:jc w:val="center"/>
-            </w:pPr>
-            <w:r>
-              <w:rPr>
-                <w:rFonts w:ascii="Calibri" w:hAnsi="Calibri"/>
-                <w:b/>
-                <w:i w:val="0"/>
-                <w:color w:val="007A87"/>
-                <w:sz w:val="20"/>
-              </w:rPr>
-              <w:t>D</w:t>
-            </w:r>
-          </w:p>
-        </w:tc>
-        <w:tc>
-          <w:tcPr>
-            <w:tcW w:type="dxa" w:w="3888"/>
+            <w:tcW w:type="dxa" w:w="5832"/>
             <w:shd w:val="clear" w:color="auto" w:fill="D4F1F4"/>
             <w:vAlign w:val="center"/>
           </w:tcPr>
@@ -2058,6 +2102,484 @@
         </w:tc>
       </w:tr>
     </w:tbl>
+    <w:p>
+      <w:pPr>
+        <w:spacing w:after="20"/>
+      </w:pPr>
+    </w:p>
+    <w:p>
+      <w:pPr>
+        <w:spacing w:before="60" w:after="40"/>
+        <w:ind w:left="170"/>
+        <w:shd w:val="clear" w:color="auto" w:fill="1A3A5C"/>
+      </w:pPr>
+      <w:r>
+        <w:rPr>
+          <w:rFonts w:ascii="Calibri" w:hAnsi="Calibri"/>
+          <w:b/>
+          <w:i w:val="0"/>
+          <w:color w:val="FFFFFF"/>
+          <w:sz w:val="24"/>
+        </w:rPr>
+        <w:t>Activity 2 Answers</w:t>
+      </w:r>
+    </w:p>
+    <w:tbl>
+      <w:tblPr>
+        <w:tblStyle w:val="TableGrid"/>
+        <w:tblW w:type="auto" w:w="0"/>
+        <w:tblLook w:firstColumn="1" w:firstRow="1" w:lastColumn="0" w:lastRow="0" w:noHBand="0" w:noVBand="1" w:val="04A0"/>
+      </w:tblPr>
+      <w:tblGrid>
+        <w:gridCol w:w="5832"/>
+        <w:gridCol w:w="5832"/>
+      </w:tblGrid>
+      <w:tr>
+        <w:tc>
+          <w:tcPr>
+            <w:tcW w:type="dxa" w:w="5832"/>
+            <w:shd w:val="clear" w:color="auto" w:fill="1A3A5C"/>
+            <w:vAlign w:val="center"/>
+          </w:tcPr>
+          <w:p>
+            <w:pPr>
+              <w:spacing w:before="40" w:after="40"/>
+              <w:jc w:val="center"/>
+            </w:pPr>
+            <w:r>
+              <w:rPr>
+                <w:rFonts w:ascii="Calibri" w:hAnsi="Calibri"/>
+                <w:b/>
+                <w:i w:val="0"/>
+                <w:color w:val="FFFFFF"/>
+                <w:sz w:val="20"/>
+              </w:rPr>
+              <w:t>Fill in the missing kana</w:t>
+            </w:r>
+          </w:p>
+        </w:tc>
+        <w:tc>
+          <w:tcPr>
+            <w:tcW w:type="dxa" w:w="5832"/>
+            <w:shd w:val="clear" w:color="auto" w:fill="1A3A5C"/>
+            <w:vAlign w:val="center"/>
+          </w:tcPr>
+          <w:p>
+            <w:pPr>
+              <w:spacing w:before="40" w:after="40"/>
+              <w:jc w:val="center"/>
+            </w:pPr>
+            <w:r>
+              <w:rPr>
+                <w:rFonts w:ascii="Calibri" w:hAnsi="Calibri"/>
+                <w:b/>
+                <w:i w:val="0"/>
+                <w:color w:val="FFFFFF"/>
+                <w:sz w:val="20"/>
+              </w:rPr>
+              <w:t>Answer</w:t>
+            </w:r>
+          </w:p>
+        </w:tc>
+      </w:tr>
+      <w:tr>
+        <w:tc>
+          <w:tcPr>
+            <w:tcW w:type="dxa" w:w="5832"/>
+            <w:shd w:val="clear" w:color="auto" w:fill="F0F6FA"/>
+            <w:vAlign w:val="center"/>
+          </w:tcPr>
+          <w:p>
+            <w:pPr>
+              <w:spacing w:before="40" w:after="40"/>
+              <w:jc w:val="center"/>
+            </w:pPr>
+            <w:r>
+              <w:rPr>
+                <w:rFonts w:ascii="Calibri" w:hAnsi="Calibri"/>
+                <w:b/>
+                <w:i w:val="0"/>
+                <w:color w:val="1A3A5C"/>
+                <w:sz w:val="22"/>
+              </w:rPr>
+              <w:t>あ  __  う  __  お</w:t>
+            </w:r>
+          </w:p>
+        </w:tc>
+        <w:tc>
+          <w:tcPr>
+            <w:tcW w:type="dxa" w:w="5832"/>
+            <w:shd w:val="clear" w:color="auto" w:fill="F0F6FA"/>
+            <w:vAlign w:val="center"/>
+          </w:tcPr>
+          <w:p>
+            <w:pPr>
+              <w:spacing w:before="40" w:after="40"/>
+              <w:jc w:val="center"/>
+            </w:pPr>
+            <w:r>
+              <w:rPr>
+                <w:rFonts w:ascii="Calibri" w:hAnsi="Calibri"/>
+                <w:b w:val="0"/>
+                <w:i w:val="0"/>
+                <w:color w:val="1A1A2E"/>
+                <w:sz w:val="20"/>
+              </w:rPr>
+              <w:t>い, え</w:t>
+            </w:r>
+          </w:p>
+        </w:tc>
+      </w:tr>
+      <w:tr>
+        <w:tc>
+          <w:tcPr>
+            <w:tcW w:type="dxa" w:w="5832"/>
+            <w:shd w:val="clear" w:color="auto" w:fill="FFFFFF"/>
+            <w:vAlign w:val="center"/>
+          </w:tcPr>
+          <w:p>
+            <w:pPr>
+              <w:spacing w:before="40" w:after="40"/>
+              <w:jc w:val="center"/>
+            </w:pPr>
+            <w:r>
+              <w:rPr>
+                <w:rFonts w:ascii="Calibri" w:hAnsi="Calibri"/>
+                <w:b/>
+                <w:i w:val="0"/>
+                <w:color w:val="1A3A5C"/>
+                <w:sz w:val="22"/>
+              </w:rPr>
+              <w:t>__  い  __  え  __</w:t>
+            </w:r>
+          </w:p>
+        </w:tc>
+        <w:tc>
+          <w:tcPr>
+            <w:tcW w:type="dxa" w:w="5832"/>
+            <w:shd w:val="clear" w:color="auto" w:fill="FFFFFF"/>
+            <w:vAlign w:val="center"/>
+          </w:tcPr>
+          <w:p>
+            <w:pPr>
+              <w:spacing w:before="40" w:after="40"/>
+              <w:jc w:val="center"/>
+            </w:pPr>
+            <w:r>
+              <w:rPr>
+                <w:rFonts w:ascii="Calibri" w:hAnsi="Calibri"/>
+                <w:b w:val="0"/>
+                <w:i w:val="0"/>
+                <w:color w:val="1A1A2E"/>
+                <w:sz w:val="20"/>
+              </w:rPr>
+              <w:t>あ, う, お</w:t>
+            </w:r>
+          </w:p>
+        </w:tc>
+      </w:tr>
+    </w:tbl>
+    <w:tbl>
+      <w:tblPr>
+        <w:tblStyle w:val="TableGrid"/>
+        <w:tblW w:type="auto" w:w="0"/>
+        <w:tblLook w:firstColumn="1" w:firstRow="1" w:lastColumn="0" w:lastRow="0" w:noHBand="0" w:noVBand="1" w:val="04A0"/>
+      </w:tblPr>
+      <w:tblGrid>
+        <w:gridCol w:w="5832"/>
+        <w:gridCol w:w="5832"/>
+      </w:tblGrid>
+      <w:tr>
+        <w:tc>
+          <w:tcPr>
+            <w:tcW w:type="dxa" w:w="5832"/>
+            <w:shd w:val="clear" w:color="auto" w:fill="007A87"/>
+            <w:vAlign w:val="center"/>
+          </w:tcPr>
+          <w:p>
+            <w:pPr>
+              <w:spacing w:before="40" w:after="40"/>
+              <w:jc w:val="center"/>
+            </w:pPr>
+            <w:r>
+              <w:rPr>
+                <w:rFonts w:ascii="Calibri" w:hAnsi="Calibri"/>
+                <w:b/>
+                <w:i w:val="0"/>
+                <w:color w:val="FFFFFF"/>
+                <w:sz w:val="20"/>
+              </w:rPr>
+              <w:t>Circle the kana that does not belong</w:t>
+            </w:r>
+          </w:p>
+        </w:tc>
+        <w:tc>
+          <w:tcPr>
+            <w:tcW w:type="dxa" w:w="5832"/>
+            <w:shd w:val="clear" w:color="auto" w:fill="007A87"/>
+            <w:vAlign w:val="center"/>
+          </w:tcPr>
+          <w:p>
+            <w:pPr>
+              <w:spacing w:before="40" w:after="40"/>
+              <w:jc w:val="center"/>
+            </w:pPr>
+            <w:r>
+              <w:rPr>
+                <w:rFonts w:ascii="Calibri" w:hAnsi="Calibri"/>
+                <w:b/>
+                <w:i w:val="0"/>
+                <w:color w:val="FFFFFF"/>
+                <w:sz w:val="20"/>
+              </w:rPr>
+              <w:t>Answer</w:t>
+            </w:r>
+          </w:p>
+        </w:tc>
+      </w:tr>
+      <w:tr>
+        <w:tc>
+          <w:tcPr>
+            <w:tcW w:type="dxa" w:w="5832"/>
+            <w:shd w:val="clear" w:color="auto" w:fill="D4F1F4"/>
+            <w:vAlign w:val="center"/>
+          </w:tcPr>
+          <w:p>
+            <w:pPr>
+              <w:spacing w:before="40" w:after="40"/>
+              <w:jc w:val="center"/>
+            </w:pPr>
+            <w:r>
+              <w:rPr>
+                <w:rFonts w:ascii="Calibri" w:hAnsi="Calibri"/>
+                <w:b/>
+                <w:i w:val="0"/>
+                <w:color w:val="1A3A5C"/>
+                <w:sz w:val="22"/>
+              </w:rPr>
+              <w:t>か   あ   い   う</w:t>
+            </w:r>
+          </w:p>
+        </w:tc>
+        <w:tc>
+          <w:tcPr>
+            <w:tcW w:type="dxa" w:w="5832"/>
+            <w:shd w:val="clear" w:color="auto" w:fill="D4F1F4"/>
+            <w:vAlign w:val="center"/>
+          </w:tcPr>
+          <w:p>
+            <w:pPr>
+              <w:spacing w:before="40" w:after="40"/>
+              <w:jc w:val="center"/>
+            </w:pPr>
+            <w:r>
+              <w:rPr>
+                <w:rFonts w:ascii="Calibri" w:hAnsi="Calibri"/>
+                <w:b w:val="0"/>
+                <w:i w:val="0"/>
+                <w:color w:val="1A1A2E"/>
+                <w:sz w:val="20"/>
+              </w:rPr>
+              <w:t>か</w:t>
+            </w:r>
+          </w:p>
+        </w:tc>
+      </w:tr>
+      <w:tr>
+        <w:tc>
+          <w:tcPr>
+            <w:tcW w:type="dxa" w:w="5832"/>
+            <w:shd w:val="clear" w:color="auto" w:fill="FFFFFF"/>
+            <w:vAlign w:val="center"/>
+          </w:tcPr>
+          <w:p>
+            <w:pPr>
+              <w:spacing w:before="40" w:after="40"/>
+              <w:jc w:val="center"/>
+            </w:pPr>
+            <w:r>
+              <w:rPr>
+                <w:rFonts w:ascii="Calibri" w:hAnsi="Calibri"/>
+                <w:b/>
+                <w:i w:val="0"/>
+                <w:color w:val="1A3A5C"/>
+                <w:sz w:val="22"/>
+              </w:rPr>
+              <w:t>い   き   う   え</w:t>
+            </w:r>
+          </w:p>
+        </w:tc>
+        <w:tc>
+          <w:tcPr>
+            <w:tcW w:type="dxa" w:w="5832"/>
+            <w:shd w:val="clear" w:color="auto" w:fill="FFFFFF"/>
+            <w:vAlign w:val="center"/>
+          </w:tcPr>
+          <w:p>
+            <w:pPr>
+              <w:spacing w:before="40" w:after="40"/>
+              <w:jc w:val="center"/>
+            </w:pPr>
+            <w:r>
+              <w:rPr>
+                <w:rFonts w:ascii="Calibri" w:hAnsi="Calibri"/>
+                <w:b w:val="0"/>
+                <w:i w:val="0"/>
+                <w:color w:val="1A1A2E"/>
+                <w:sz w:val="20"/>
+              </w:rPr>
+              <w:t>き</w:t>
+            </w:r>
+          </w:p>
+        </w:tc>
+      </w:tr>
+      <w:tr>
+        <w:tc>
+          <w:tcPr>
+            <w:tcW w:type="dxa" w:w="5832"/>
+            <w:shd w:val="clear" w:color="auto" w:fill="D4F1F4"/>
+            <w:vAlign w:val="center"/>
+          </w:tcPr>
+          <w:p>
+            <w:pPr>
+              <w:spacing w:before="40" w:after="40"/>
+              <w:jc w:val="center"/>
+            </w:pPr>
+            <w:r>
+              <w:rPr>
+                <w:rFonts w:ascii="Calibri" w:hAnsi="Calibri"/>
+                <w:b/>
+                <w:i w:val="0"/>
+                <w:color w:val="1A3A5C"/>
+                <w:sz w:val="22"/>
+              </w:rPr>
+              <w:t>う   え   く   お</w:t>
+            </w:r>
+          </w:p>
+        </w:tc>
+        <w:tc>
+          <w:tcPr>
+            <w:tcW w:type="dxa" w:w="5832"/>
+            <w:shd w:val="clear" w:color="auto" w:fill="D4F1F4"/>
+            <w:vAlign w:val="center"/>
+          </w:tcPr>
+          <w:p>
+            <w:pPr>
+              <w:spacing w:before="40" w:after="40"/>
+              <w:jc w:val="center"/>
+            </w:pPr>
+            <w:r>
+              <w:rPr>
+                <w:rFonts w:ascii="Calibri" w:hAnsi="Calibri"/>
+                <w:b w:val="0"/>
+                <w:i w:val="0"/>
+                <w:color w:val="1A1A2E"/>
+                <w:sz w:val="20"/>
+              </w:rPr>
+              <w:t>く</w:t>
+            </w:r>
+          </w:p>
+        </w:tc>
+      </w:tr>
+    </w:tbl>
+    <w:p>
+      <w:pPr>
+        <w:spacing w:after="20"/>
+      </w:pPr>
+    </w:p>
+    <w:p>
+      <w:pPr>
+        <w:spacing w:before="80" w:after="40"/>
+      </w:pPr>
+      <w:r>
+        <w:rPr>
+          <w:rFonts w:ascii="Calibri" w:hAnsi="Calibri"/>
+          <w:b/>
+          <w:i w:val="0"/>
+          <w:color w:val="007A87"/>
+          <w:sz w:val="24"/>
+        </w:rPr>
+        <w:t>Important reminders</w:t>
+      </w:r>
+    </w:p>
+    <w:p>
+      <w:pPr>
+        <w:spacing w:before="0" w:after="20"/>
+        <w:ind w:left="340"/>
+      </w:pPr>
+      <w:r>
+        <w:rPr>
+          <w:rFonts w:ascii="Calibri" w:hAnsi="Calibri"/>
+          <w:b/>
+          <w:i w:val="0"/>
+          <w:color w:val="E6A817"/>
+          <w:sz w:val="20"/>
+        </w:rPr>
+        <w:t xml:space="preserve">▸ </w:t>
+      </w:r>
+      <w:r>
+        <w:rPr>
+          <w:rFonts w:ascii="Calibri" w:hAnsi="Calibri"/>
+          <w:b w:val="0"/>
+          <w:i w:val="0"/>
+          <w:color w:val="1A1A2E"/>
+          <w:sz w:val="20"/>
+        </w:rPr>
+        <w:t>One hiragana usually represents one sound beat.</w:t>
+      </w:r>
+    </w:p>
+    <w:p>
+      <w:pPr>
+        <w:spacing w:before="0" w:after="20"/>
+        <w:ind w:left="340"/>
+      </w:pPr>
+      <w:r>
+        <w:rPr>
+          <w:rFonts w:ascii="Calibri" w:hAnsi="Calibri"/>
+          <w:b/>
+          <w:i w:val="0"/>
+          <w:color w:val="E6A817"/>
+          <w:sz w:val="20"/>
+        </w:rPr>
+        <w:t xml:space="preserve">▸ </w:t>
+      </w:r>
+      <w:r>
+        <w:rPr>
+          <w:rFonts w:ascii="Calibri" w:hAnsi="Calibri"/>
+          <w:b w:val="0"/>
+          <w:i w:val="0"/>
+          <w:color w:val="1A1A2E"/>
+          <w:sz w:val="20"/>
+        </w:rPr>
+        <w:t>Most rows follow the vowel order a, i, u, e, o, even when one sound is slightly irregular.</w:t>
+      </w:r>
+    </w:p>
+    <w:p>
+      <w:pPr>
+        <w:spacing w:before="0" w:after="20"/>
+        <w:ind w:left="340"/>
+      </w:pPr>
+      <w:r>
+        <w:rPr>
+          <w:rFonts w:ascii="Calibri" w:hAnsi="Calibri"/>
+          <w:b/>
+          <w:i w:val="0"/>
+          <w:color w:val="E6A817"/>
+          <w:sz w:val="20"/>
+        </w:rPr>
+        <w:t xml:space="preserve">▸ </w:t>
+      </w:r>
+      <w:r>
+        <w:rPr>
+          <w:rFonts w:ascii="Calibri" w:hAnsi="Calibri"/>
+          <w:b w:val="0"/>
+          <w:i w:val="0"/>
+          <w:color w:val="1A1A2E"/>
+          <w:sz w:val="20"/>
+        </w:rPr>
+        <w:t>If a row has a special reading, say it slowly first and then return to the full row pattern.</w:t>
+      </w:r>
+    </w:p>
     <w:p>
       <w:pPr>
         <w:spacing w:after="20"/>

</xml_diff>

<commit_message>
Make hiragana worksheet examples non-revealing
Co-authored-by: sin-boo <sin-boo@users.noreply.github.com>
</commit_message>
<xml_diff>
--- a/japanese_docs/output/hiragana_series/hiragana_set_01_vowels_worksheet.docx
+++ b/japanese_docs/output/hiragana_series/hiragana_set_01_vowels_worksheet.docx
@@ -364,6 +364,61 @@
         <w:t>Worked Examples</w:t>
       </w:r>
     </w:p>
+    <w:p>
+      <w:pPr>
+        <w:spacing w:before="20" w:after="40"/>
+      </w:pPr>
+      <w:r>
+        <w:rPr>
+          <w:rFonts w:ascii="Calibri" w:hAnsi="Calibri"/>
+          <w:b w:val="0"/>
+          <w:i w:val="0"/>
+          <w:color w:val="1A1A2E"/>
+          <w:sz w:val="20"/>
+        </w:rPr>
+        <w:t xml:space="preserve">These examples show the </w:t>
+      </w:r>
+      <w:r>
+        <w:rPr>
+          <w:rFonts w:ascii="Calibri" w:hAnsi="Calibri"/>
+          <w:b/>
+          <w:i w:val="0"/>
+          <w:color w:val="007A87"/>
+          <w:sz w:val="20"/>
+        </w:rPr>
+        <w:t>format only</w:t>
+      </w:r>
+      <w:r>
+        <w:rPr>
+          <w:rFonts w:ascii="Calibri" w:hAnsi="Calibri"/>
+          <w:b w:val="0"/>
+          <w:i w:val="0"/>
+          <w:color w:val="1A1A2E"/>
+          <w:sz w:val="20"/>
+        </w:rPr>
+        <w:t xml:space="preserve">. They are </w:t>
+      </w:r>
+      <w:r>
+        <w:rPr>
+          <w:rFonts w:ascii="Calibri" w:hAnsi="Calibri"/>
+          <w:b/>
+          <w:i w:val="0"/>
+          <w:color w:val="1A3A5C"/>
+          <w:sz w:val="20"/>
+        </w:rPr>
+        <w:t>not</w:t>
+      </w:r>
+      <w:r>
+        <w:rPr>
+          <w:rFonts w:ascii="Calibri" w:hAnsi="Calibri"/>
+          <w:b w:val="0"/>
+          <w:i w:val="0"/>
+          <w:color w:val="1A1A2E"/>
+          <w:sz w:val="20"/>
+        </w:rPr>
+        <w:t xml:space="preserve"> answers to the real questions below.</w:t>
+      </w:r>
+    </w:p>
     <w:tbl>
       <w:tblPr>
         <w:tblStyle w:val="TableGrid"/>
@@ -409,7 +464,7 @@
                 <w:color w:val="1A3A5C"/>
                 <w:sz w:val="22"/>
               </w:rPr>
-              <w:t>あ</w:t>
+              <w:t>[kana]  -&gt;  [your reading]</w:t>
             </w:r>
           </w:p>
           <w:p>
@@ -424,7 +479,7 @@
                 <w:color w:val="1A1A2E"/>
                 <w:sz w:val="18"/>
               </w:rPr>
-              <w:t>Answer: a</w:t>
+              <w:t>Answer: Write one short romaji answer on the line.</w:t>
             </w:r>
           </w:p>
         </w:tc>
@@ -461,7 +516,7 @@
                 <w:color w:val="1A3A5C"/>
                 <w:sz w:val="22"/>
               </w:rPr>
-              <w:t>あい</w:t>
+              <w:t>A  __  C  __  E</w:t>
             </w:r>
           </w:p>
           <w:p>
@@ -476,7 +531,7 @@
                 <w:color w:val="1A1A2E"/>
                 <w:sz w:val="18"/>
               </w:rPr>
-              <w:t>Answer: a-i</w:t>
+              <w:t>Answer: Fill in the missing middle parts of the pattern.</w:t>
             </w:r>
           </w:p>
         </w:tc>
@@ -513,7 +568,7 @@
                 <w:color w:val="1A3A5C"/>
                 <w:sz w:val="22"/>
               </w:rPr>
-              <w:t>あ  __  う  __  お</w:t>
+              <w:t>A  B  X  B</w:t>
             </w:r>
           </w:p>
           <w:p>
@@ -528,7 +583,7 @@
                 <w:color w:val="1A1A2E"/>
                 <w:sz w:val="18"/>
               </w:rPr>
-              <w:t>Answer: い, え</w:t>
+              <w:t>Answer: Circle the one item that does not belong.</w:t>
             </w:r>
           </w:p>
         </w:tc>
@@ -588,7 +643,7 @@
           <w:color w:val="1A1A2E"/>
           <w:sz w:val="20"/>
         </w:rPr>
-        <w:t xml:space="preserve">. Example: </w:t>
+        <w:t xml:space="preserve">. Write the sound from memory. </w:t>
       </w:r>
       <w:r>
         <w:rPr>
@@ -598,7 +653,17 @@
           <w:color w:val="1A3A5C"/>
           <w:sz w:val="20"/>
         </w:rPr>
-        <w:t>あ = a</w:t>
+        <w:t>Do not use the examples as answers</w:t>
+      </w:r>
+      <w:r>
+        <w:rPr>
+          <w:rFonts w:ascii="Calibri" w:hAnsi="Calibri"/>
+          <w:b w:val="0"/>
+          <w:i w:val="0"/>
+          <w:color w:val="1A1A2E"/>
+          <w:sz w:val="20"/>
+        </w:rPr>
+        <w:t xml:space="preserve"> because they only show how the activity works.</w:t>
       </w:r>
     </w:p>
     <w:tbl>

</xml_diff>

<commit_message>
Use cross-row kana examples in hiragana worksheets
Co-authored-by: sin-boo <sin-boo@users.noreply.github.com>
</commit_message>
<xml_diff>
--- a/japanese_docs/output/hiragana_series/hiragana_set_01_vowels_worksheet.docx
+++ b/japanese_docs/output/hiragana_series/hiragana_set_01_vowels_worksheet.docx
@@ -464,7 +464,7 @@
                 <w:color w:val="1A3A5C"/>
                 <w:sz w:val="22"/>
               </w:rPr>
-              <w:t>[kana]  -&gt;  [your reading]</w:t>
+              <w:t>さ  -&gt;  sa</w:t>
             </w:r>
           </w:p>
           <w:p>
@@ -479,7 +479,7 @@
                 <w:color w:val="1A1A2E"/>
                 <w:sz w:val="18"/>
               </w:rPr>
-              <w:t>Answer: Write one short romaji answer on the line.</w:t>
+              <w:t>Answer: Example from a different row.</w:t>
             </w:r>
           </w:p>
         </w:tc>
@@ -516,7 +516,7 @@
                 <w:color w:val="1A3A5C"/>
                 <w:sz w:val="22"/>
               </w:rPr>
-              <w:t>A  __  C  __  E</w:t>
+              <w:t>さし</w:t>
             </w:r>
           </w:p>
           <w:p>
@@ -531,7 +531,7 @@
                 <w:color w:val="1A1A2E"/>
                 <w:sz w:val="18"/>
               </w:rPr>
-              <w:t>Answer: Fill in the missing middle parts of the pattern.</w:t>
+              <w:t>Answer: sa-shi</w:t>
             </w:r>
           </w:p>
         </w:tc>
@@ -568,7 +568,7 @@
                 <w:color w:val="1A3A5C"/>
                 <w:sz w:val="22"/>
               </w:rPr>
-              <w:t>A  B  X  B</w:t>
+              <w:t>さ  __  す  __  そ</w:t>
             </w:r>
           </w:p>
           <w:p>
@@ -583,7 +583,7 @@
                 <w:color w:val="1A1A2E"/>
                 <w:sz w:val="18"/>
               </w:rPr>
-              <w:t>Answer: Circle the one item that does not belong.</w:t>
+              <w:t>Answer: し, せ</w:t>
             </w:r>
           </w:p>
         </w:tc>
@@ -644,6 +644,26 @@
           <w:sz w:val="20"/>
         </w:rPr>
         <w:t xml:space="preserve">. Write the sound from memory. </w:t>
+      </w:r>
+      <w:r>
+        <w:rPr>
+          <w:rFonts w:ascii="Calibri" w:hAnsi="Calibri"/>
+          <w:b/>
+          <w:i w:val="0"/>
+          <w:color w:val="E6A817"/>
+          <w:sz w:val="20"/>
+        </w:rPr>
+        <w:t xml:space="preserve">Example from another row: </w:t>
+      </w:r>
+      <w:r>
+        <w:rPr>
+          <w:rFonts w:ascii="Calibri" w:hAnsi="Calibri"/>
+          <w:b w:val="0"/>
+          <w:i/>
+          <w:color w:val="6B7B8D"/>
+          <w:sz w:val="20"/>
+        </w:rPr>
+        <w:t xml:space="preserve">さ = sa. </w:t>
       </w:r>
       <w:r>
         <w:rPr>

</xml_diff>

<commit_message>
Add neuralforge footer watermark
Co-authored-by: sin-boo <sin-boo@users.noreply.github.com>
</commit_message>
<xml_diff>
--- a/japanese_docs/output/hiragana_series/hiragana_set_01_vowels_worksheet.docx
+++ b/japanese_docs/output/hiragana_series/hiragana_set_01_vowels_worksheet.docx
@@ -2862,6 +2862,7 @@
       </w:r>
     </w:p>
     <w:sectPr>
+      <w:footerReference w:type="default" r:id="rId9"/>
       <w:pgSz w:w="12240" w:h="15840"/>
       <w:pgMar w:top="288" w:right="288" w:bottom="288" w:left="288" w:header="720" w:footer="720" w:gutter="0"/>
       <w:cols w:space="720"/>
@@ -2869,6 +2870,28 @@
     </w:sectPr>
   </w:body>
 </w:document>
+</file>
+
+<file path=word/footer1.xml><?xml version="1.0" encoding="utf-8"?>
+<w:ftr xmlns:m="http://schemas.openxmlformats.org/officeDocument/2006/math" xmlns:mc="http://schemas.openxmlformats.org/markup-compatibility/2006" xmlns:mo="http://schemas.microsoft.com/office/mac/office/2008/main" xmlns:mv="urn:schemas-microsoft-com:mac:vml" xmlns:o="urn:schemas-microsoft-com:office:office" xmlns:r="http://schemas.openxmlformats.org/officeDocument/2006/relationships" xmlns:v="urn:schemas-microsoft-com:vml" xmlns:w10="urn:schemas-microsoft-com:office:word" xmlns:w14="http://schemas.microsoft.com/office/word/2010/wordml" xmlns:w="http://schemas.openxmlformats.org/wordprocessingml/2006/main" xmlns:wne="http://schemas.microsoft.com/office/word/2006/wordml" xmlns:wp14="http://schemas.microsoft.com/office/word/2010/wordprocessingDrawing" xmlns:wp="http://schemas.openxmlformats.org/drawingml/2006/wordprocessingDrawing" xmlns:wpc="http://schemas.microsoft.com/office/word/2010/wordprocessingCanvas" xmlns:wpg="http://schemas.microsoft.com/office/word/2010/wordprocessingGroup" xmlns:wpi="http://schemas.microsoft.com/office/word/2010/wordprocessingInk" xmlns:wps="http://schemas.microsoft.com/office/word/2010/wordprocessingShape" mc:Ignorable="w14 wp14">
+  <w:p>
+    <w:pPr>
+      <w:pStyle w:val="Footer"/>
+      <w:spacing w:before="0" w:after="0"/>
+      <w:jc w:val="right"/>
+    </w:pPr>
+    <w:r>
+      <w:rPr>
+        <w:rFonts w:ascii="Calibri" w:hAnsi="Calibri"/>
+        <w:b w:val="0"/>
+        <w:i w:val="0"/>
+        <w:color w:val="6B7B8D"/>
+        <w:sz w:val="14"/>
+      </w:rPr>
+      <w:t>neuralforge.cc</w:t>
+    </w:r>
+  </w:p>
+</w:ftr>
 </file>
 
 <file path=word/numbering.xml><?xml version="1.0" encoding="utf-8"?>

</xml_diff>